<commit_message>
feat: add index landing page and update project documentation
</commit_message>
<xml_diff>
--- a/CondoCare_MVP.docx
+++ b/CondoCare_MVP.docx
@@ -56,7 +56,7 @@
           <w:sz w:val="28"/>
           <w:szCs w:val="28"/>
         </w:rPr>
-        <w:t xml:space="preserve">1. Cos'è CondoCare</w:t>
+        <w:t xml:space="preserve">1. L'MVP nel contesto della Test Card 5</w:t>
       </w:r>
     </w:p>
     <w:p>
@@ -67,15 +67,11 @@
       <w:r>
         <w:rPr>
           <w:rFonts w:ascii="Arial" w:cs="Arial" w:eastAsia="Arial" w:hAnsi="Arial"/>
-          <w:b w:val="false"/>
-          <w:bCs w:val="false"/>
-          <w:i w:val="false"/>
-          <w:iCs w:val="false"/>
           <w:color w:val="1A1A1A"/>
           <w:sz w:val="22"/>
           <w:szCs w:val="22"/>
         </w:rPr>
-        <w:t xml:space="preserve">CondoCare è un assistente AI per studi di amministrazione condominiale. I residenti chattano via browser con un chatbot che risponde alle loro domande basandosi sui documenti caricati dall'amministratore — regolamenti, verbali assembleari, circolari. Quando il sistema non ha informazioni sufficienti per rispondere con sicurezza, la richiesta viene inoltrata automaticamente all'amministratore, che la gestisce da una dashboard dedicata.</w:t>
+        <w:t xml:space="preserve">La Test Card 5 chiede di mettere in campo un MVP funzionale a bassa fedelta' e osservare come si comportano utenti reali in condizioni d'uso non assistite. L'MVP di CondoCare e' stato costruito esattamente per questo: non e' un prodotto finito, e' uno strumento di osservazione.</w:t>
       </w:r>
     </w:p>
     <w:p>
@@ -86,15 +82,117 @@
       <w:r>
         <w:rPr>
           <w:rFonts w:ascii="Arial" w:cs="Arial" w:eastAsia="Arial" w:hAnsi="Arial"/>
-          <w:b w:val="false"/>
-          <w:bCs w:val="false"/>
-          <w:i w:val="false"/>
-          <w:iCs w:val="false"/>
           <w:color w:val="1A1A1A"/>
           <w:sz w:val="22"/>
           <w:szCs w:val="22"/>
         </w:rPr>
-        <w:t xml:space="preserve">L'MVP non punta a sostituire l'amministratore. Punta a eliminare il carico di richieste ripetitive e a basso valore aggiunto — quelle che oggi vengono gestite via telefono o e-mail, senza tracciatura e con tempi di risposta lunghi.</w:t>
+        <w:t xml:space="preserve">Per validare le ipotesi della test card servono tre cose concrete: un sistema che i condomini possano usare senza spiegazioni, documenti reali che l'amministratore carichi in autonomia, e una dashboard che mostri le richieste organizzate senza richiedere configurazione. L'MVP offre tutte e tre.</w:t>
+      </w:r>
+    </w:p>
+    <w:p>
+      <w:pPr>
+        <w:spacing w:after="100" w:before="80"/>
+        <w:jc w:val="left"/>
+      </w:pPr>
+      <w:r>
+        <w:rPr>
+          <w:rFonts w:ascii="Arial" w:cs="Arial" w:eastAsia="Arial" w:hAnsi="Arial"/>
+          <w:color w:val="1A1A1A"/>
+          <w:sz w:val="22"/>
+          <w:szCs w:val="22"/>
+        </w:rPr>
+        <w:t xml:space="preserve">In pratica, durante il test:</w:t>
+      </w:r>
+    </w:p>
+    <w:p>
+      <w:pPr>
+        <w:pStyle w:val="ListParagraph"/>
+        <w:numPr>
+          <w:ilvl w:val="0"/>
+          <w:numId w:val="2"/>
+        </w:numPr>
+        <w:spacing w:after="50" w:before="50"/>
+      </w:pPr>
+      <w:r>
+        <w:rPr>
+          <w:rFonts w:ascii="Arial" w:cs="Arial" w:eastAsia="Arial" w:hAnsi="Arial"/>
+          <w:color w:val="1A1A1A"/>
+          <w:sz w:val="22"/>
+          <w:szCs w:val="22"/>
+        </w:rPr>
+        <w:t xml:space="preserve">L'amministratore riceve un link alla pagina di gestione documenti e carica i propri regolamenti e verbali</w:t>
+      </w:r>
+    </w:p>
+    <w:p>
+      <w:pPr>
+        <w:pStyle w:val="ListParagraph"/>
+        <w:numPr>
+          <w:ilvl w:val="0"/>
+          <w:numId w:val="2"/>
+        </w:numPr>
+        <w:spacing w:after="50" w:before="50"/>
+      </w:pPr>
+      <w:r>
+        <w:rPr>
+          <w:rFonts w:ascii="Arial" w:cs="Arial" w:eastAsia="Arial" w:hAnsi="Arial"/>
+          <w:color w:val="1A1A1A"/>
+          <w:sz w:val="22"/>
+          <w:szCs w:val="22"/>
+        </w:rPr>
+        <w:t xml:space="preserve">I condomini ricevono un link diretto alla chat - nessuna app, nessuna registrazione</w:t>
+      </w:r>
+    </w:p>
+    <w:p>
+      <w:pPr>
+        <w:pStyle w:val="ListParagraph"/>
+        <w:numPr>
+          <w:ilvl w:val="0"/>
+          <w:numId w:val="2"/>
+        </w:numPr>
+        <w:spacing w:after="50" w:before="50"/>
+      </w:pPr>
+      <w:r>
+        <w:rPr>
+          <w:rFonts w:ascii="Arial" w:cs="Arial" w:eastAsia="Arial" w:hAnsi="Arial"/>
+          <w:color w:val="1A1A1A"/>
+          <w:sz w:val="22"/>
+          <w:szCs w:val="22"/>
+        </w:rPr>
+        <w:t xml:space="preserve">Le interazioni avvengono in autonomia: il team non e' presente, non guida, non suggerisce</w:t>
+      </w:r>
+    </w:p>
+    <w:p>
+      <w:pPr>
+        <w:pStyle w:val="ListParagraph"/>
+        <w:numPr>
+          <w:ilvl w:val="0"/>
+          <w:numId w:val="2"/>
+        </w:numPr>
+        <w:spacing w:after="50" w:before="50"/>
+      </w:pPr>
+      <w:r>
+        <w:rPr>
+          <w:rFonts w:ascii="Arial" w:cs="Arial" w:eastAsia="Arial" w:hAnsi="Arial"/>
+          <w:color w:val="1A1A1A"/>
+          <w:sz w:val="22"/>
+          <w:szCs w:val="22"/>
+        </w:rPr>
+        <w:t xml:space="preserve">A fine sessione, il team raccoglie i dati dalla dashboard e somministra i questionari</w:t>
+      </w:r>
+    </w:p>
+    <w:p>
+      <w:pPr>
+        <w:spacing w:after="100" w:before="80"/>
+        <w:jc w:val="both"/>
+      </w:pPr>
+      <w:r>
+        <w:rPr>
+          <w:rFonts w:ascii="Arial" w:cs="Arial" w:eastAsia="Arial" w:hAnsi="Arial"/>
+          <w:color w:val="1A1A1A"/>
+          <w:sz w:val="22"/>
+          <w:szCs w:val="22"/>
+        </w:rPr>
+        <w:t xml:space="preserve">Il valore del test non sta nel numero di richieste gestite, ma nella qualita' dell'osservazione: il sistema viene usato spontaneamente? L'amministratore trova le informazioni che cerca? Il condomino capisce cosa sta facendo?</w:t>
       </w:r>
     </w:p>
     <w:p/>
@@ -112,7 +210,7 @@
           <w:sz w:val="28"/>
           <w:szCs w:val="28"/>
         </w:rPr>
-        <w:t xml:space="preserve">2. Come è stato costruito</w:t>
+        <w:t xml:space="preserve">2. Come e' stato costruito</w:t>
       </w:r>
     </w:p>
     <w:p>
@@ -123,15 +221,11 @@
       <w:r>
         <w:rPr>
           <w:rFonts w:ascii="Arial" w:cs="Arial" w:eastAsia="Arial" w:hAnsi="Arial"/>
-          <w:b w:val="false"/>
-          <w:bCs w:val="false"/>
-          <w:i w:val="false"/>
-          <w:iCs w:val="false"/>
           <w:color w:val="1A1A1A"/>
           <w:sz w:val="22"/>
           <w:szCs w:val="22"/>
         </w:rPr>
-        <w:t xml:space="preserve">L'MVP è un sistema funzionante, non un mockup. Le scelte tecniche sono state fatte per minimizzare il tempo di costruzione e massimizzare la capacità di osservare comportamenti reali.</w:t>
+        <w:t xml:space="preserve">L'MVP e' un sistema funzionante, non un mockup. Le scelte tecniche sono state fatte per minimizzare il tempo di costruzione e massimizzare la capacita' di osservare comportamenti reali.</w:t>
       </w:r>
     </w:p>
     <w:p/>
@@ -255,7 +349,7 @@
                 <w:sz w:val="20"/>
                 <w:szCs w:val="20"/>
               </w:rPr>
-              <w:t xml:space="preserve">Chat condòmino</w:t>
+              <w:t xml:space="preserve">Chat condomino</w:t>
             </w:r>
           </w:p>
         </w:tc>
@@ -275,8 +369,12 @@
               <w:bottom w:type="dxa" w:w="100"/>
               <w:right w:type="dxa" w:w="140"/>
             </w:tcMar>
-          </w:tcPr>
-          <w:p>
+            <w:vAlign w:val="top"/>
+          </w:tcPr>
+          <w:p>
+            <w:pPr>
+              <w:jc w:val="left"/>
+            </w:pPr>
             <w:r>
               <w:rPr>
                 <w:rFonts w:ascii="Arial" w:cs="Arial" w:eastAsia="Arial" w:hAnsi="Arial"/>
@@ -340,18 +438,22 @@
               <w:bottom w:type="dxa" w:w="100"/>
               <w:right w:type="dxa" w:w="140"/>
             </w:tcMar>
-          </w:tcPr>
-          <w:p>
-            <w:r>
-              <w:rPr>
-                <w:rFonts w:ascii="Arial" w:cs="Arial" w:eastAsia="Arial" w:hAnsi="Arial"/>
-                <w:b w:val="false"/>
-                <w:bCs w:val="false"/>
-                <w:color w:val="1A1A1A"/>
-                <w:sz w:val="20"/>
-                <w:szCs w:val="20"/>
-              </w:rPr>
-              <w:t xml:space="preserve">L'amministratore vede in tempo reale le richieste arrivate, classificate per categoria e priorità, e può rispondere direttamente</w:t>
+            <w:vAlign w:val="top"/>
+          </w:tcPr>
+          <w:p>
+            <w:pPr>
+              <w:jc w:val="left"/>
+            </w:pPr>
+            <w:r>
+              <w:rPr>
+                <w:rFonts w:ascii="Arial" w:cs="Arial" w:eastAsia="Arial" w:hAnsi="Arial"/>
+                <w:b w:val="false"/>
+                <w:bCs w:val="false"/>
+                <w:color w:val="1A1A1A"/>
+                <w:sz w:val="20"/>
+                <w:szCs w:val="20"/>
+              </w:rPr>
+              <w:t xml:space="preserve">L'amministratore vede in tempo reale le richieste arrivate, classificate per categoria e priorita', e puo' rispondere direttamente</w:t>
             </w:r>
           </w:p>
         </w:tc>
@@ -405,8 +507,12 @@
               <w:bottom w:type="dxa" w:w="100"/>
               <w:right w:type="dxa" w:w="140"/>
             </w:tcMar>
-          </w:tcPr>
-          <w:p>
+            <w:vAlign w:val="top"/>
+          </w:tcPr>
+          <w:p>
+            <w:pPr>
+              <w:jc w:val="left"/>
+            </w:pPr>
             <w:r>
               <w:rPr>
                 <w:rFonts w:ascii="Arial" w:cs="Arial" w:eastAsia="Arial" w:hAnsi="Arial"/>
@@ -470,18 +576,22 @@
               <w:bottom w:type="dxa" w:w="100"/>
               <w:right w:type="dxa" w:w="140"/>
             </w:tcMar>
-          </w:tcPr>
-          <w:p>
-            <w:r>
-              <w:rPr>
-                <w:rFonts w:ascii="Arial" w:cs="Arial" w:eastAsia="Arial" w:hAnsi="Arial"/>
-                <w:b w:val="false"/>
-                <w:bCs w:val="false"/>
-                <w:color w:val="1A1A1A"/>
-                <w:sz w:val="20"/>
-                <w:szCs w:val="20"/>
-              </w:rPr>
-              <w:t xml:space="preserve">Ogni messaggio del condòmino viene confrontato con i documenti caricati. Il sistema seleziona i passaggi più rilevanti e li passa al modello AI come contesto</w:t>
+            <w:vAlign w:val="top"/>
+          </w:tcPr>
+          <w:p>
+            <w:pPr>
+              <w:jc w:val="left"/>
+            </w:pPr>
+            <w:r>
+              <w:rPr>
+                <w:rFonts w:ascii="Arial" w:cs="Arial" w:eastAsia="Arial" w:hAnsi="Arial"/>
+                <w:b w:val="false"/>
+                <w:bCs w:val="false"/>
+                <w:color w:val="1A1A1A"/>
+                <w:sz w:val="20"/>
+                <w:szCs w:val="20"/>
+              </w:rPr>
+              <w:t xml:space="preserve">Ogni messaggio del condomino viene confrontato con i documenti caricati. Il sistema seleziona i passaggi piu' rilevanti e li passa al modello AI come contesto</w:t>
             </w:r>
           </w:p>
         </w:tc>
@@ -535,8 +645,12 @@
               <w:bottom w:type="dxa" w:w="100"/>
               <w:right w:type="dxa" w:w="140"/>
             </w:tcMar>
-          </w:tcPr>
-          <w:p>
+            <w:vAlign w:val="top"/>
+          </w:tcPr>
+          <w:p>
+            <w:pPr>
+              <w:jc w:val="left"/>
+            </w:pPr>
             <w:r>
               <w:rPr>
                 <w:rFonts w:ascii="Arial" w:cs="Arial" w:eastAsia="Arial" w:hAnsi="Arial"/>
@@ -600,18 +714,22 @@
               <w:bottom w:type="dxa" w:w="100"/>
               <w:right w:type="dxa" w:w="140"/>
             </w:tcMar>
-          </w:tcPr>
-          <w:p>
-            <w:r>
-              <w:rPr>
-                <w:rFonts w:ascii="Arial" w:cs="Arial" w:eastAsia="Arial" w:hAnsi="Arial"/>
-                <w:b w:val="false"/>
-                <w:bCs w:val="false"/>
-                <w:color w:val="1A1A1A"/>
-                <w:sz w:val="20"/>
-                <w:szCs w:val="20"/>
-              </w:rPr>
-              <w:t xml:space="preserve">Ogni richiesta viene classificata per categoria (documentale, amministrativa, informativa, segnalazione) e priorità (urgente, alta, normale, bassa). Le richieste risolte dall'AI chiudono il ticket automaticamente; le altre restano aperte per l'admin</w:t>
+            <w:vAlign w:val="top"/>
+          </w:tcPr>
+          <w:p>
+            <w:pPr>
+              <w:jc w:val="left"/>
+            </w:pPr>
+            <w:r>
+              <w:rPr>
+                <w:rFonts w:ascii="Arial" w:cs="Arial" w:eastAsia="Arial" w:hAnsi="Arial"/>
+                <w:b w:val="false"/>
+                <w:bCs w:val="false"/>
+                <w:color w:val="1A1A1A"/>
+                <w:sz w:val="20"/>
+                <w:szCs w:val="20"/>
+              </w:rPr>
+              <w:t xml:space="preserve">Ogni richiesta viene classificata per categoria (documentale, amministrativa, informativa, segnalazione) e priorita' (urgente, alta, normale, bassa). Le richieste risolte dall'AI chiudono il ticket automaticamente; le altre restano aperte per l'admin</w:t>
             </w:r>
           </w:p>
         </w:tc>
@@ -651,7 +769,7 @@
           <w:sz w:val="22"/>
           <w:szCs w:val="22"/>
         </w:rPr>
-        <w:t xml:space="preserve">Il condòmino scrive un messaggio via chat</w:t>
+        <w:t xml:space="preserve">Il condomino scrive un messaggio via chat</w:t>
       </w:r>
     </w:p>
     <w:p>
@@ -670,7 +788,7 @@
           <w:sz w:val="22"/>
           <w:szCs w:val="22"/>
         </w:rPr>
-        <w:t xml:space="preserve">Il sistema cerca nei documenti caricati i passaggi più pertinenti</w:t>
+        <w:t xml:space="preserve">Il sistema cerca nei documenti caricati i passaggi piu' pertinenti</w:t>
       </w:r>
     </w:p>
     <w:p>
@@ -708,7 +826,7 @@
           <w:sz w:val="22"/>
           <w:szCs w:val="22"/>
         </w:rPr>
-        <w:t xml:space="preserve">Se confidenza alta o media → risposta inviata automaticamente, ticket chiuso</w:t>
+        <w:t xml:space="preserve">Se confidenza alta o media: risposta inviata automaticamente, ticket chiuso</w:t>
       </w:r>
     </w:p>
     <w:p>
@@ -727,7 +845,7 @@
           <w:sz w:val="22"/>
           <w:szCs w:val="22"/>
         </w:rPr>
-        <w:t xml:space="preserve">Se confidenza bassa → ticket aperto, admin notificato in tempo reale sulla dashboard</w:t>
+        <w:t xml:space="preserve">Se confidenza bassa: ticket aperto, admin notificato in tempo reale sulla dashboard</w:t>
       </w:r>
     </w:p>
     <w:p>
@@ -746,7 +864,7 @@
           <w:sz w:val="22"/>
           <w:szCs w:val="22"/>
         </w:rPr>
-        <w:t xml:space="preserve">L'admin risponde; il condòmino vede la risposta entro pochi secondi</w:t>
+        <w:t xml:space="preserve">L'admin risponde; il condomino vede la risposta entro pochi secondi</w:t>
       </w:r>
     </w:p>
     <w:p/>
@@ -764,7 +882,7 @@
           <w:sz w:val="28"/>
           <w:szCs w:val="28"/>
         </w:rPr>
-        <w:t xml:space="preserve">3. Come è stato pensato</w:t>
+        <w:t xml:space="preserve">3. Come e' stato pensato</w:t>
       </w:r>
     </w:p>
     <w:p>
@@ -775,29 +893,21 @@
       <w:r>
         <w:rPr>
           <w:rFonts w:ascii="Arial" w:cs="Arial" w:eastAsia="Arial" w:hAnsi="Arial"/>
-          <w:b w:val="false"/>
-          <w:bCs w:val="false"/>
-          <w:i w:val="false"/>
-          <w:iCs w:val="false"/>
           <w:color w:val="1A1A1A"/>
           <w:sz w:val="22"/>
           <w:szCs w:val="22"/>
         </w:rPr>
-        <w:t xml:space="preserve">Il principio guida è stato: costruire il minimo necessario per osservare comportamenti reali. Non un prodotto completo, non un mockup. Un sistema funzionante abbastanza da far interagire utenti veri con dati veri.</w:t>
+        <w:t xml:space="preserve">Il principio guida e' stato: costruire il minimo necessario per osservare comportamenti reali. Non un prodotto completo, non un mockup. Un sistema funzionante abbastanza da far interagire utenti veri con dati veri.</w:t>
       </w:r>
     </w:p>
     <w:p>
       <w:pPr>
         <w:spacing w:after="100" w:before="80"/>
-        <w:jc w:val="both"/>
+        <w:jc w:val="left"/>
       </w:pPr>
       <w:r>
         <w:rPr>
           <w:rFonts w:ascii="Arial" w:cs="Arial" w:eastAsia="Arial" w:hAnsi="Arial"/>
-          <w:b w:val="false"/>
-          <w:bCs w:val="false"/>
-          <w:i w:val="false"/>
-          <w:iCs w:val="false"/>
           <w:color w:val="1A1A1A"/>
           <w:sz w:val="22"/>
           <w:szCs w:val="22"/>
@@ -821,7 +931,7 @@
           <w:sz w:val="22"/>
           <w:szCs w:val="22"/>
         </w:rPr>
-        <w:t xml:space="preserve">Nessun database esterno — i ticket sono su file, i documenti in una cartella. Zero dipendenze, deploy in pochi minuti</w:t>
+        <w:t xml:space="preserve">Nessun database esterno - i ticket sono su file, i documenti in una cartella. Zero dipendenze, deploy in pochi minuti</w:t>
       </w:r>
     </w:p>
     <w:p>
@@ -840,7 +950,7 @@
           <w:sz w:val="22"/>
           <w:szCs w:val="22"/>
         </w:rPr>
-        <w:t xml:space="preserve">Nessun framework frontend — quattro pagine HTML. Modificabili in ore, non giorni</w:t>
+        <w:t xml:space="preserve">Nessun framework frontend - quattro pagine HTML. Modificabili in ore, non giorni</w:t>
       </w:r>
     </w:p>
     <w:p>
@@ -859,7 +969,7 @@
           <w:sz w:val="22"/>
           <w:szCs w:val="22"/>
         </w:rPr>
-        <w:t xml:space="preserve">RAG senza embedding — ricerca per parole chiave, sufficiente per knowledge base piccole (&lt; 50 documenti)</w:t>
+        <w:t xml:space="preserve">RAG senza embedding - ricerca per parole chiave, sufficiente per knowledge base piccole (&lt; 50 documenti)</w:t>
       </w:r>
     </w:p>
     <w:p>
@@ -878,7 +988,7 @@
           <w:sz w:val="22"/>
           <w:szCs w:val="22"/>
         </w:rPr>
-        <w:t xml:space="preserve">Un solo modello LLM in cloud (Groq, gratuito in test) — sostituibile senza toccare il resto del sistema</w:t>
+        <w:t xml:space="preserve">Un solo modello LLM in cloud (Groq, gratuito in test) - sostituibile senza toccare il resto del sistema</w:t>
       </w:r>
     </w:p>
     <w:p>
@@ -889,15 +999,11 @@
       <w:r>
         <w:rPr>
           <w:rFonts w:ascii="Arial" w:cs="Arial" w:eastAsia="Arial" w:hAnsi="Arial"/>
-          <w:b w:val="false"/>
-          <w:bCs w:val="false"/>
-          <w:i w:val="false"/>
-          <w:iCs w:val="false"/>
           <w:color w:val="1A1A1A"/>
           <w:sz w:val="22"/>
           <w:szCs w:val="22"/>
         </w:rPr>
-        <w:t xml:space="preserve">La semplicità non è un limite temporaneo da correggere: è la condizione che ha reso possibile avere un sistema funzionante in tempi compatibili con la validazione. Ogni componente è pensato per essere sostituito se il test conferma che vale la pena investire.</w:t>
+        <w:t xml:space="preserve">La semplicita' non e' un limite temporaneo: e' la condizione che ha reso possibile avere un sistema funzionante in tempi compatibili con la validazione. Ogni componente e' pensato per essere sostituito se il test conferma che vale la pena investire.</w:t>
       </w:r>
     </w:p>
     <w:p/>
@@ -916,7 +1022,7 @@
           <w:sz w:val="28"/>
           <w:szCs w:val="28"/>
         </w:rPr>
-        <w:t xml:space="preserve">4. Test Card 5 — Validazione Comportamentale</w:t>
+        <w:t xml:space="preserve">4. Test Card 5 - Validazione Comportamentale</w:t>
       </w:r>
     </w:p>
     <w:p>
@@ -927,10 +1033,6 @@
       <w:r>
         <w:rPr>
           <w:rFonts w:ascii="Arial" w:cs="Arial" w:eastAsia="Arial" w:hAnsi="Arial"/>
-          <w:b w:val="false"/>
-          <w:bCs w:val="false"/>
-          <w:i w:val="false"/>
-          <w:iCs w:val="false"/>
           <w:color w:val="1A1A1A"/>
           <w:sz w:val="22"/>
           <w:szCs w:val="22"/>
@@ -990,7 +1092,7 @@
                 <w:sz w:val="24"/>
                 <w:szCs w:val="24"/>
               </w:rPr>
-              <w:t xml:space="preserve">Test Card 5 — Behavioral Validation</w:t>
+              <w:t xml:space="preserve">Test Card 5 - Behavioral Validation</w:t>
             </w:r>
           </w:p>
         </w:tc>
@@ -1044,18 +1146,22 @@
               <w:bottom w:type="dxa" w:w="100"/>
               <w:right w:type="dxa" w:w="140"/>
             </w:tcMar>
-          </w:tcPr>
-          <w:p>
-            <w:r>
-              <w:rPr>
-                <w:rFonts w:ascii="Arial" w:cs="Arial" w:eastAsia="Arial" w:hAnsi="Arial"/>
-                <w:b w:val="false"/>
-                <w:bCs w:val="false"/>
-                <w:color w:val="1A1A1A"/>
-                <w:sz w:val="20"/>
-                <w:szCs w:val="20"/>
-              </w:rPr>
-              <w:t xml:space="preserve">Crediamo che un MVP funzionale di CondoCare sia in grado di supportare la gestione di richieste condominiali reali, generando valore percepito sia per i condòmini sia per gli amministratori.</w:t>
+            <w:vAlign w:val="top"/>
+          </w:tcPr>
+          <w:p>
+            <w:pPr>
+              <w:jc w:val="left"/>
+            </w:pPr>
+            <w:r>
+              <w:rPr>
+                <w:rFonts w:ascii="Arial" w:cs="Arial" w:eastAsia="Arial" w:hAnsi="Arial"/>
+                <w:b w:val="false"/>
+                <w:bCs w:val="false"/>
+                <w:color w:val="1A1A1A"/>
+                <w:sz w:val="20"/>
+                <w:szCs w:val="20"/>
+              </w:rPr>
+              <w:t xml:space="preserve">Crediamo che un MVP funzionale di CondoCare sia in grado di supportare la gestione di richieste condominiali reali, generando valore percepito sia per i condomini sia per gli amministratori.</w:t>
             </w:r>
           </w:p>
         </w:tc>
@@ -1126,7 +1232,7 @@
                 <w:sz w:val="20"/>
                 <w:szCs w:val="20"/>
               </w:rPr>
-              <w:t xml:space="preserve">Sviluppo di un MVP funzionale a bassa fedeltà</w:t>
+              <w:t xml:space="preserve">Sviluppo di un MVP funzionale a bassa fedelta'</w:t>
             </w:r>
           </w:p>
           <w:p>
@@ -1164,7 +1270,7 @@
                 <w:sz w:val="20"/>
                 <w:szCs w:val="20"/>
               </w:rPr>
-              <w:t xml:space="preserve">Utilizzo del chatbot AI da parte di 4 condòmini reali</w:t>
+              <w:t xml:space="preserve">Utilizzo del chatbot AI da parte di 4 condomini reali</w:t>
             </w:r>
           </w:p>
           <w:p>
@@ -1292,7 +1398,7 @@
                 <w:sz w:val="20"/>
                 <w:szCs w:val="20"/>
               </w:rPr>
-              <w:t xml:space="preserve">Capacità di clusterizzazione delle richieste</w:t>
+              <w:t xml:space="preserve">Capacita' di clusterizzazione delle richieste</w:t>
             </w:r>
           </w:p>
           <w:p>
@@ -1311,7 +1417,7 @@
                 <w:sz w:val="20"/>
                 <w:szCs w:val="20"/>
               </w:rPr>
-              <w:t xml:space="preserve">Percezione utilità del sistema da parte degli amministratori</w:t>
+              <w:t xml:space="preserve">Percezione utilita' del sistema da parte degli amministratori</w:t>
             </w:r>
           </w:p>
           <w:p>
@@ -1330,7 +1436,7 @@
                 <w:sz w:val="20"/>
                 <w:szCs w:val="20"/>
               </w:rPr>
-              <w:t xml:space="preserve">Soddisfazione percepita dei condòmini</w:t>
+              <w:t xml:space="preserve">Soddisfazione percepita dei condomini</w:t>
             </w:r>
           </w:p>
         </w:tc>
@@ -1436,7 +1542,7 @@
                 <w:sz w:val="20"/>
                 <w:szCs w:val="20"/>
               </w:rPr>
-              <w:t xml:space="preserve">gli amministratori riconoscono utilità operativa nella clusterizzazione e nella dashboard</w:t>
+              <w:t xml:space="preserve">gli amministratori riconoscono utilita' operativa nella clusterizzazione e nella dashboard</w:t>
             </w:r>
           </w:p>
           <w:p>
@@ -1455,7 +1561,7 @@
                 <w:sz w:val="20"/>
                 <w:szCs w:val="20"/>
               </w:rPr>
-              <w:t xml:space="preserve">i condòmini percepiscono il sistema come semplice e comprensibile</w:t>
+              <w:t xml:space="preserve">i condomini percepiscono il sistema come semplice e comprensibile</w:t>
             </w:r>
           </w:p>
         </w:tc>
@@ -1509,8 +1615,12 @@
               <w:bottom w:type="dxa" w:w="100"/>
               <w:right w:type="dxa" w:w="140"/>
             </w:tcMar>
-          </w:tcPr>
-          <w:p>
+            <w:vAlign w:val="top"/>
+          </w:tcPr>
+          <w:p>
+            <w:pPr>
+              <w:jc w:val="left"/>
+            </w:pPr>
             <w:r>
               <w:rPr>
                 <w:rFonts w:ascii="Arial" w:cs="Arial" w:eastAsia="Arial" w:hAnsi="Arial"/>
@@ -1574,18 +1684,22 @@
               <w:bottom w:type="dxa" w:w="100"/>
               <w:right w:type="dxa" w:w="140"/>
             </w:tcMar>
-          </w:tcPr>
-          <w:p>
-            <w:r>
-              <w:rPr>
-                <w:rFonts w:ascii="Arial" w:cs="Arial" w:eastAsia="Arial" w:hAnsi="Arial"/>
-                <w:b w:val="false"/>
-                <w:bCs w:val="false"/>
-                <w:color w:val="1A1A1A"/>
-                <w:sz w:val="20"/>
-                <w:szCs w:val="20"/>
-              </w:rPr>
-              <w:t xml:space="preserve">Il test consente di distinguere tra interesse dichiarato e reale disponibilità all'adozione.</w:t>
+            <w:vAlign w:val="top"/>
+          </w:tcPr>
+          <w:p>
+            <w:pPr>
+              <w:jc w:val="left"/>
+            </w:pPr>
+            <w:r>
+              <w:rPr>
+                <w:rFonts w:ascii="Arial" w:cs="Arial" w:eastAsia="Arial" w:hAnsi="Arial"/>
+                <w:b w:val="false"/>
+                <w:bCs w:val="false"/>
+                <w:color w:val="1A1A1A"/>
+                <w:sz w:val="20"/>
+                <w:szCs w:val="20"/>
+              </w:rPr>
+              <w:t xml:space="preserve">Il test consente di distinguere tra interesse dichiarato e reale disponibilita' all'adozione.</w:t>
             </w:r>
           </w:p>
         </w:tc>
@@ -1660,20 +1774,17 @@
     <w:p>
       <w:pPr>
         <w:spacing w:after="100" w:before="80"/>
-        <w:jc w:val="left"/>
       </w:pPr>
       <w:r>
         <w:rPr>
           <w:rFonts w:ascii="Arial" w:cs="Arial" w:eastAsia="Arial" w:hAnsi="Arial"/>
-          <w:b w:val="false"/>
-          <w:bCs w:val="false"/>
           <w:i/>
           <w:iCs/>
-          <w:color w:val="1A1A1A"/>
-          <w:sz w:val="22"/>
-          <w:szCs w:val="22"/>
+          <w:color w:val="555555"/>
+          <w:sz w:val="20"/>
+          <w:szCs w:val="20"/>
         </w:rPr>
-        <w:t xml:space="preserve">Tabella 9 – Test Card 5</w:t>
+        <w:t xml:space="preserve">Tabella 9 - Test Card 5</w:t>
       </w:r>
     </w:p>
     <w:p/>
@@ -1697,15 +1808,11 @@
     <w:p>
       <w:pPr>
         <w:spacing w:after="100" w:before="80"/>
-        <w:jc w:val="both"/>
+        <w:jc w:val="left"/>
       </w:pPr>
       <w:r>
         <w:rPr>
           <w:rFonts w:ascii="Arial" w:cs="Arial" w:eastAsia="Arial" w:hAnsi="Arial"/>
-          <w:b w:val="false"/>
-          <w:bCs w:val="false"/>
-          <w:i w:val="false"/>
-          <w:iCs w:val="false"/>
           <w:color w:val="1A1A1A"/>
           <w:sz w:val="22"/>
           <w:szCs w:val="22"/>
@@ -1822,8 +1929,12 @@
               <w:bottom w:type="dxa" w:w="100"/>
               <w:right w:type="dxa" w:w="140"/>
             </w:tcMar>
-          </w:tcPr>
-          <w:p>
+            <w:vAlign w:val="top"/>
+          </w:tcPr>
+          <w:p>
+            <w:pPr>
+              <w:jc w:val="left"/>
+            </w:pPr>
             <w:r>
               <w:rPr>
                 <w:rFonts w:ascii="Arial" w:cs="Arial" w:eastAsia="Arial" w:hAnsi="Arial"/>
@@ -1853,8 +1964,12 @@
               <w:bottom w:type="dxa" w:w="100"/>
               <w:right w:type="dxa" w:w="140"/>
             </w:tcMar>
-          </w:tcPr>
-          <w:p>
+            <w:vAlign w:val="top"/>
+          </w:tcPr>
+          <w:p>
+            <w:pPr>
+              <w:jc w:val="left"/>
+            </w:pPr>
             <w:r>
               <w:rPr>
                 <w:rFonts w:ascii="Arial" w:cs="Arial" w:eastAsia="Arial" w:hAnsi="Arial"/>
@@ -1886,18 +2001,22 @@
               <w:bottom w:type="dxa" w:w="100"/>
               <w:right w:type="dxa" w:w="140"/>
             </w:tcMar>
-          </w:tcPr>
-          <w:p>
-            <w:r>
-              <w:rPr>
-                <w:rFonts w:ascii="Arial" w:cs="Arial" w:eastAsia="Arial" w:hAnsi="Arial"/>
-                <w:b w:val="false"/>
-                <w:bCs w:val="false"/>
-                <w:color w:val="1A1A1A"/>
-                <w:sz w:val="20"/>
-                <w:szCs w:val="20"/>
-              </w:rPr>
-              <w:t xml:space="preserve">4 condòmini reali che usano il chatbot</w:t>
+            <w:vAlign w:val="top"/>
+          </w:tcPr>
+          <w:p>
+            <w:pPr>
+              <w:jc w:val="left"/>
+            </w:pPr>
+            <w:r>
+              <w:rPr>
+                <w:rFonts w:ascii="Arial" w:cs="Arial" w:eastAsia="Arial" w:hAnsi="Arial"/>
+                <w:b w:val="false"/>
+                <w:bCs w:val="false"/>
+                <w:color w:val="1A1A1A"/>
+                <w:sz w:val="20"/>
+                <w:szCs w:val="20"/>
+              </w:rPr>
+              <w:t xml:space="preserve">4 condomini reali che usano il chatbot</w:t>
             </w:r>
           </w:p>
         </w:tc>
@@ -1917,18 +2036,22 @@
               <w:bottom w:type="dxa" w:w="100"/>
               <w:right w:type="dxa" w:w="140"/>
             </w:tcMar>
-          </w:tcPr>
-          <w:p>
-            <w:r>
-              <w:rPr>
-                <w:rFonts w:ascii="Arial" w:cs="Arial" w:eastAsia="Arial" w:hAnsi="Arial"/>
-                <w:b w:val="false"/>
-                <w:bCs w:val="false"/>
-                <w:color w:val="1A1A1A"/>
-                <w:sz w:val="20"/>
-                <w:szCs w:val="20"/>
-              </w:rPr>
-              <w:t xml:space="preserve">La chat è accessibile via link, senza app né registrazione — l'attrito di ingresso è minimo</w:t>
+            <w:vAlign w:val="top"/>
+          </w:tcPr>
+          <w:p>
+            <w:pPr>
+              <w:jc w:val="left"/>
+            </w:pPr>
+            <w:r>
+              <w:rPr>
+                <w:rFonts w:ascii="Arial" w:cs="Arial" w:eastAsia="Arial" w:hAnsi="Arial"/>
+                <w:b w:val="false"/>
+                <w:bCs w:val="false"/>
+                <w:color w:val="1A1A1A"/>
+                <w:sz w:val="20"/>
+                <w:szCs w:val="20"/>
+              </w:rPr>
+              <w:t xml:space="preserve">La chat e' accessibile via link, senza app ne' registrazione - l'attrito di ingresso e' minimo</w:t>
             </w:r>
           </w:p>
         </w:tc>
@@ -1950,8 +2073,12 @@
               <w:bottom w:type="dxa" w:w="100"/>
               <w:right w:type="dxa" w:w="140"/>
             </w:tcMar>
-          </w:tcPr>
-          <w:p>
+            <w:vAlign w:val="top"/>
+          </w:tcPr>
+          <w:p>
+            <w:pPr>
+              <w:jc w:val="left"/>
+            </w:pPr>
             <w:r>
               <w:rPr>
                 <w:rFonts w:ascii="Arial" w:cs="Arial" w:eastAsia="Arial" w:hAnsi="Arial"/>
@@ -1981,18 +2108,22 @@
               <w:bottom w:type="dxa" w:w="100"/>
               <w:right w:type="dxa" w:w="140"/>
             </w:tcMar>
-          </w:tcPr>
-          <w:p>
-            <w:r>
-              <w:rPr>
-                <w:rFonts w:ascii="Arial" w:cs="Arial" w:eastAsia="Arial" w:hAnsi="Arial"/>
-                <w:b w:val="false"/>
-                <w:bCs w:val="false"/>
-                <w:color w:val="1A1A1A"/>
-                <w:sz w:val="20"/>
-                <w:szCs w:val="20"/>
-              </w:rPr>
-              <w:t xml:space="preserve">La dashboard mostra i ticket in tempo reale con categoria e priorità già assegnate; l'admin non deve configurare nulla</w:t>
+            <w:vAlign w:val="top"/>
+          </w:tcPr>
+          <w:p>
+            <w:pPr>
+              <w:jc w:val="left"/>
+            </w:pPr>
+            <w:r>
+              <w:rPr>
+                <w:rFonts w:ascii="Arial" w:cs="Arial" w:eastAsia="Arial" w:hAnsi="Arial"/>
+                <w:b w:val="false"/>
+                <w:bCs w:val="false"/>
+                <w:color w:val="1A1A1A"/>
+                <w:sz w:val="20"/>
+                <w:szCs w:val="20"/>
+              </w:rPr>
+              <w:t xml:space="preserve">La dashboard mostra i ticket in tempo reale con categoria e priorita' gia' assegnate; l'admin non deve configurare nulla</w:t>
             </w:r>
           </w:p>
         </w:tc>
@@ -2014,8 +2145,12 @@
               <w:bottom w:type="dxa" w:w="100"/>
               <w:right w:type="dxa" w:w="140"/>
             </w:tcMar>
-          </w:tcPr>
-          <w:p>
+            <w:vAlign w:val="top"/>
+          </w:tcPr>
+          <w:p>
+            <w:pPr>
+              <w:jc w:val="left"/>
+            </w:pPr>
             <w:r>
               <w:rPr>
                 <w:rFonts w:ascii="Arial" w:cs="Arial" w:eastAsia="Arial" w:hAnsi="Arial"/>
@@ -2045,18 +2180,22 @@
               <w:bottom w:type="dxa" w:w="100"/>
               <w:right w:type="dxa" w:w="140"/>
             </w:tcMar>
-          </w:tcPr>
-          <w:p>
-            <w:r>
-              <w:rPr>
-                <w:rFonts w:ascii="Arial" w:cs="Arial" w:eastAsia="Arial" w:hAnsi="Arial"/>
-                <w:b w:val="false"/>
-                <w:bCs w:val="false"/>
-                <w:color w:val="1A1A1A"/>
-                <w:sz w:val="20"/>
-                <w:szCs w:val="20"/>
-              </w:rPr>
-              <w:t xml:space="preserve">Il sistema classifica automaticamente ogni richiesta — i ticket sono immediatamente filtrabili per tipo e urgenza</w:t>
+            <w:vAlign w:val="top"/>
+          </w:tcPr>
+          <w:p>
+            <w:pPr>
+              <w:jc w:val="left"/>
+            </w:pPr>
+            <w:r>
+              <w:rPr>
+                <w:rFonts w:ascii="Arial" w:cs="Arial" w:eastAsia="Arial" w:hAnsi="Arial"/>
+                <w:b w:val="false"/>
+                <w:bCs w:val="false"/>
+                <w:color w:val="1A1A1A"/>
+                <w:sz w:val="20"/>
+                <w:szCs w:val="20"/>
+              </w:rPr>
+              <w:t xml:space="preserve">Il sistema classifica automaticamente ogni richiesta - i ticket sono immediatamente filtrabili per tipo e urgenza</w:t>
             </w:r>
           </w:p>
         </w:tc>
@@ -2078,8 +2217,12 @@
               <w:bottom w:type="dxa" w:w="100"/>
               <w:right w:type="dxa" w:w="140"/>
             </w:tcMar>
-          </w:tcPr>
-          <w:p>
+            <w:vAlign w:val="top"/>
+          </w:tcPr>
+          <w:p>
+            <w:pPr>
+              <w:jc w:val="left"/>
+            </w:pPr>
             <w:r>
               <w:rPr>
                 <w:rFonts w:ascii="Arial" w:cs="Arial" w:eastAsia="Arial" w:hAnsi="Arial"/>
@@ -2109,23 +2252,3179 @@
               <w:bottom w:type="dxa" w:w="100"/>
               <w:right w:type="dxa" w:w="140"/>
             </w:tcMar>
-          </w:tcPr>
-          <w:p>
-            <w:r>
-              <w:rPr>
-                <w:rFonts w:ascii="Arial" w:cs="Arial" w:eastAsia="Arial" w:hAnsi="Arial"/>
-                <w:b w:val="false"/>
-                <w:bCs w:val="false"/>
-                <w:color w:val="1A1A1A"/>
-                <w:sz w:val="20"/>
-                <w:szCs w:val="20"/>
-              </w:rPr>
-              <w:t xml:space="preserve">Il sistema funziona senza intervento del team: si può osservare cosa succede quando gli utenti interagiscono da soli</w:t>
+            <w:vAlign w:val="top"/>
+          </w:tcPr>
+          <w:p>
+            <w:pPr>
+              <w:jc w:val="left"/>
+            </w:pPr>
+            <w:r>
+              <w:rPr>
+                <w:rFonts w:ascii="Arial" w:cs="Arial" w:eastAsia="Arial" w:hAnsi="Arial"/>
+                <w:b w:val="false"/>
+                <w:bCs w:val="false"/>
+                <w:color w:val="1A1A1A"/>
+                <w:sz w:val="20"/>
+                <w:szCs w:val="20"/>
+              </w:rPr>
+              <w:t xml:space="preserve">Il sistema funziona senza intervento del team: si puo' osservare cosa succede quando gli utenti interagiscono da soli</w:t>
             </w:r>
           </w:p>
         </w:tc>
       </w:tr>
     </w:tbl>
+    <w:p/>
+    <w:p/>
+    <w:p>
+      <w:pPr>
+        <w:pStyle w:val="Heading1"/>
+        <w:spacing w:after="160" w:before="400"/>
+      </w:pPr>
+      <w:r>
+        <w:rPr>
+          <w:rFonts w:ascii="Arial" w:cs="Arial" w:eastAsia="Arial" w:hAnsi="Arial"/>
+          <w:b/>
+          <w:bCs/>
+          <w:color w:val="1B3A6B"/>
+          <w:sz w:val="28"/>
+          <w:szCs w:val="28"/>
+        </w:rPr>
+        <w:t xml:space="preserve">5. Questionari di validazione</w:t>
+      </w:r>
+    </w:p>
+    <w:p>
+      <w:pPr>
+        <w:spacing w:after="100" w:before="80"/>
+        <w:jc w:val="both"/>
+      </w:pPr>
+      <w:r>
+        <w:rPr>
+          <w:rFonts w:ascii="Arial" w:cs="Arial" w:eastAsia="Arial" w:hAnsi="Arial"/>
+          <w:color w:val="1A1A1A"/>
+          <w:sz w:val="22"/>
+          <w:szCs w:val="22"/>
+        </w:rPr>
+        <w:t xml:space="preserve">I questionari vengono somministrati al termine della sessione di test, separatamente ai due gruppi. Le domande sono calibrate sulle metriche e i criteri della Test Card 5. Le risposte in scala 1-5 alimentano le metriche quantitative; le domande aperte raccolgono le osservazioni qualitative che i numeri non catturano.</w:t>
+      </w:r>
+    </w:p>
+    <w:p/>
+    <w:p>
+      <w:pPr>
+        <w:pStyle w:val="Heading2"/>
+        <w:spacing w:after="100" w:before="260"/>
+      </w:pPr>
+      <w:r>
+        <w:rPr>
+          <w:rFonts w:ascii="Arial" w:cs="Arial" w:eastAsia="Arial" w:hAnsi="Arial"/>
+          <w:b/>
+          <w:bCs/>
+          <w:color w:val="1B3A6B"/>
+          <w:sz w:val="24"/>
+          <w:szCs w:val="24"/>
+        </w:rPr>
+        <w:t xml:space="preserve">Questionario A - Condomini</w:t>
+      </w:r>
+    </w:p>
+    <w:p>
+      <w:pPr>
+        <w:spacing w:after="100" w:before="80"/>
+      </w:pPr>
+      <w:r>
+        <w:rPr>
+          <w:rFonts w:ascii="Arial" w:cs="Arial" w:eastAsia="Arial" w:hAnsi="Arial"/>
+          <w:i/>
+          <w:iCs/>
+          <w:color w:val="555555"/>
+          <w:sz w:val="20"/>
+          <w:szCs w:val="20"/>
+        </w:rPr>
+        <w:t xml:space="preserve">Da somministrare ai 4 condomini dopo la sessione di chat. Tempo stimato: 5 minuti.</w:t>
+      </w:r>
+    </w:p>
+    <w:p/>
+    <w:tbl>
+      <w:tblPr>
+        <w:tblW w:type="dxa" w:w="9026"/>
+        <w:tblBorders>
+          <w:top w:val="single" w:color="auto" w:sz="4"/>
+          <w:left w:val="single" w:color="auto" w:sz="4"/>
+          <w:bottom w:val="single" w:color="auto" w:sz="4"/>
+          <w:right w:val="single" w:color="auto" w:sz="4"/>
+          <w:insideH w:val="single" w:color="auto" w:sz="4"/>
+          <w:insideV w:val="single" w:color="auto" w:sz="4"/>
+        </w:tblBorders>
+      </w:tblPr>
+      <w:tblGrid>
+        <w:gridCol w:w="440"/>
+        <w:gridCol w:w="5106"/>
+        <w:gridCol w:w="1000"/>
+        <w:gridCol w:w="1480"/>
+        <w:gridCol w:w="1000"/>
+      </w:tblGrid>
+      <w:tr>
+        <w:trPr>
+          <w:tblHeader/>
+        </w:trPr>
+        <w:tc>
+          <w:tcPr>
+            <w:tcW w:type="dxa" w:w="440"/>
+            <w:tcBorders>
+              <w:top w:val="single" w:color="C5D5E8" w:sz="4"/>
+              <w:left w:val="single" w:color="C5D5E8" w:sz="4"/>
+              <w:bottom w:val="single" w:color="C5D5E8" w:sz="4"/>
+              <w:right w:val="single" w:color="C5D5E8" w:sz="4"/>
+            </w:tcBorders>
+            <w:shd w:fill="1B3A6B" w:val="clear"/>
+            <w:tcMar>
+              <w:top w:type="dxa" w:w="100"/>
+              <w:left w:type="dxa" w:w="140"/>
+              <w:bottom w:type="dxa" w:w="100"/>
+              <w:right w:type="dxa" w:w="140"/>
+            </w:tcMar>
+            <w:vAlign w:val="center"/>
+          </w:tcPr>
+          <w:p>
+            <w:pPr>
+              <w:jc w:val="center"/>
+            </w:pPr>
+            <w:r>
+              <w:rPr>
+                <w:rFonts w:ascii="Arial" w:cs="Arial" w:eastAsia="Arial" w:hAnsi="Arial"/>
+                <w:b/>
+                <w:bCs/>
+                <w:color w:val="FFFFFF"/>
+                <w:sz w:val="20"/>
+                <w:szCs w:val="20"/>
+              </w:rPr>
+              <w:t xml:space="preserve">N.</w:t>
+            </w:r>
+          </w:p>
+        </w:tc>
+        <w:tc>
+          <w:tcPr>
+            <w:tcW w:type="dxa" w:w="5106"/>
+            <w:tcBorders>
+              <w:top w:val="single" w:color="C5D5E8" w:sz="4"/>
+              <w:left w:val="single" w:color="C5D5E8" w:sz="4"/>
+              <w:bottom w:val="single" w:color="C5D5E8" w:sz="4"/>
+              <w:right w:val="single" w:color="C5D5E8" w:sz="4"/>
+            </w:tcBorders>
+            <w:shd w:fill="1B3A6B" w:val="clear"/>
+            <w:tcMar>
+              <w:top w:type="dxa" w:w="100"/>
+              <w:left w:type="dxa" w:w="140"/>
+              <w:bottom w:type="dxa" w:w="100"/>
+              <w:right w:type="dxa" w:w="140"/>
+            </w:tcMar>
+            <w:vAlign w:val="center"/>
+          </w:tcPr>
+          <w:p>
+            <w:pPr>
+              <w:jc w:val="center"/>
+            </w:pPr>
+            <w:r>
+              <w:rPr>
+                <w:rFonts w:ascii="Arial" w:cs="Arial" w:eastAsia="Arial" w:hAnsi="Arial"/>
+                <w:b/>
+                <w:bCs/>
+                <w:color w:val="FFFFFF"/>
+                <w:sz w:val="20"/>
+                <w:szCs w:val="20"/>
+              </w:rPr>
+              <w:t xml:space="preserve">Domanda</w:t>
+            </w:r>
+          </w:p>
+        </w:tc>
+        <w:tc>
+          <w:tcPr>
+            <w:tcW w:type="dxa" w:w="1000"/>
+            <w:tcBorders>
+              <w:top w:val="single" w:color="C5D5E8" w:sz="4"/>
+              <w:left w:val="single" w:color="C5D5E8" w:sz="4"/>
+              <w:bottom w:val="single" w:color="C5D5E8" w:sz="4"/>
+              <w:right w:val="single" w:color="C5D5E8" w:sz="4"/>
+            </w:tcBorders>
+            <w:shd w:fill="1B3A6B" w:val="clear"/>
+            <w:tcMar>
+              <w:top w:type="dxa" w:w="100"/>
+              <w:left w:type="dxa" w:w="140"/>
+              <w:bottom w:type="dxa" w:w="100"/>
+              <w:right w:type="dxa" w:w="140"/>
+            </w:tcMar>
+            <w:vAlign w:val="center"/>
+          </w:tcPr>
+          <w:p>
+            <w:pPr>
+              <w:jc w:val="center"/>
+            </w:pPr>
+            <w:r>
+              <w:rPr>
+                <w:rFonts w:ascii="Arial" w:cs="Arial" w:eastAsia="Arial" w:hAnsi="Arial"/>
+                <w:b/>
+                <w:bCs/>
+                <w:color w:val="FFFFFF"/>
+                <w:sz w:val="20"/>
+                <w:szCs w:val="20"/>
+              </w:rPr>
+              <w:t xml:space="preserve">Scala</w:t>
+            </w:r>
+          </w:p>
+        </w:tc>
+        <w:tc>
+          <w:tcPr>
+            <w:tcW w:type="dxa" w:w="1480"/>
+            <w:tcBorders>
+              <w:top w:val="single" w:color="C5D5E8" w:sz="4"/>
+              <w:left w:val="single" w:color="C5D5E8" w:sz="4"/>
+              <w:bottom w:val="single" w:color="C5D5E8" w:sz="4"/>
+              <w:right w:val="single" w:color="C5D5E8" w:sz="4"/>
+            </w:tcBorders>
+            <w:shd w:fill="1B3A6B" w:val="clear"/>
+            <w:tcMar>
+              <w:top w:type="dxa" w:w="100"/>
+              <w:left w:type="dxa" w:w="140"/>
+              <w:bottom w:type="dxa" w:w="100"/>
+              <w:right w:type="dxa" w:w="140"/>
+            </w:tcMar>
+            <w:vAlign w:val="center"/>
+          </w:tcPr>
+          <w:p>
+            <w:pPr>
+              <w:jc w:val="center"/>
+            </w:pPr>
+            <w:r>
+              <w:rPr>
+                <w:rFonts w:ascii="Arial" w:cs="Arial" w:eastAsia="Arial" w:hAnsi="Arial"/>
+                <w:b/>
+                <w:bCs/>
+                <w:color w:val="FFFFFF"/>
+                <w:sz w:val="20"/>
+                <w:szCs w:val="20"/>
+              </w:rPr>
+              <w:t xml:space="preserve">Metrica TC5</w:t>
+            </w:r>
+          </w:p>
+        </w:tc>
+        <w:tc>
+          <w:tcPr>
+            <w:tcW w:type="dxa" w:w="1000"/>
+            <w:tcBorders>
+              <w:top w:val="single" w:color="C5D5E8" w:sz="4"/>
+              <w:left w:val="single" w:color="C5D5E8" w:sz="4"/>
+              <w:bottom w:val="single" w:color="C5D5E8" w:sz="4"/>
+              <w:right w:val="single" w:color="C5D5E8" w:sz="4"/>
+            </w:tcBorders>
+            <w:shd w:fill="1B3A6B" w:val="clear"/>
+            <w:tcMar>
+              <w:top w:type="dxa" w:w="100"/>
+              <w:left w:type="dxa" w:w="140"/>
+              <w:bottom w:type="dxa" w:w="100"/>
+              <w:right w:type="dxa" w:w="140"/>
+            </w:tcMar>
+            <w:vAlign w:val="center"/>
+          </w:tcPr>
+          <w:p>
+            <w:pPr>
+              <w:jc w:val="center"/>
+            </w:pPr>
+            <w:r>
+              <w:rPr>
+                <w:rFonts w:ascii="Arial" w:cs="Arial" w:eastAsia="Arial" w:hAnsi="Arial"/>
+                <w:b/>
+                <w:bCs/>
+                <w:color w:val="FFFFFF"/>
+                <w:sz w:val="20"/>
+                <w:szCs w:val="20"/>
+              </w:rPr>
+              <w:t xml:space="preserve">Risposta</w:t>
+            </w:r>
+          </w:p>
+        </w:tc>
+      </w:tr>
+      <w:tr>
+        <w:tc>
+          <w:tcPr>
+            <w:tcW w:type="dxa" w:w="440"/>
+            <w:tcBorders>
+              <w:top w:val="single" w:color="C5D5E8" w:sz="4"/>
+              <w:left w:val="single" w:color="C5D5E8" w:sz="4"/>
+              <w:bottom w:val="single" w:color="C5D5E8" w:sz="4"/>
+              <w:right w:val="single" w:color="C5D5E8" w:sz="4"/>
+            </w:tcBorders>
+            <w:shd w:fill="FFFFFF" w:val="clear"/>
+            <w:tcMar>
+              <w:top w:type="dxa" w:w="100"/>
+              <w:left w:type="dxa" w:w="140"/>
+              <w:bottom w:type="dxa" w:w="100"/>
+              <w:right w:type="dxa" w:w="140"/>
+            </w:tcMar>
+            <w:vAlign w:val="top"/>
+          </w:tcPr>
+          <w:p>
+            <w:pPr>
+              <w:jc w:val="center"/>
+            </w:pPr>
+            <w:r>
+              <w:rPr>
+                <w:rFonts w:ascii="Arial" w:cs="Arial" w:eastAsia="Arial" w:hAnsi="Arial"/>
+                <w:b/>
+                <w:bCs/>
+                <w:color w:val="1A1A1A"/>
+                <w:sz w:val="20"/>
+                <w:szCs w:val="20"/>
+              </w:rPr>
+              <w:t xml:space="preserve">1</w:t>
+            </w:r>
+          </w:p>
+        </w:tc>
+        <w:tc>
+          <w:tcPr>
+            <w:tcW w:type="dxa" w:w="5106"/>
+            <w:tcBorders>
+              <w:top w:val="single" w:color="C5D5E8" w:sz="4"/>
+              <w:left w:val="single" w:color="C5D5E8" w:sz="4"/>
+              <w:bottom w:val="single" w:color="C5D5E8" w:sz="4"/>
+              <w:right w:val="single" w:color="C5D5E8" w:sz="4"/>
+            </w:tcBorders>
+            <w:shd w:fill="FFFFFF" w:val="clear"/>
+            <w:tcMar>
+              <w:top w:type="dxa" w:w="100"/>
+              <w:left w:type="dxa" w:w="140"/>
+              <w:bottom w:type="dxa" w:w="100"/>
+              <w:right w:type="dxa" w:w="140"/>
+            </w:tcMar>
+            <w:vAlign w:val="top"/>
+          </w:tcPr>
+          <w:p>
+            <w:pPr>
+              <w:jc w:val="left"/>
+            </w:pPr>
+            <w:r>
+              <w:rPr>
+                <w:rFonts w:ascii="Arial" w:cs="Arial" w:eastAsia="Arial" w:hAnsi="Arial"/>
+                <w:b w:val="false"/>
+                <w:bCs w:val="false"/>
+                <w:color w:val="1A1A1A"/>
+                <w:sz w:val="20"/>
+                <w:szCs w:val="20"/>
+              </w:rPr>
+              <w:t xml:space="preserve">Hai trovato facile iniziare a usare la chat senza istruzioni?</w:t>
+            </w:r>
+          </w:p>
+        </w:tc>
+        <w:tc>
+          <w:tcPr>
+            <w:tcW w:type="dxa" w:w="1000"/>
+            <w:tcBorders>
+              <w:top w:val="single" w:color="C5D5E8" w:sz="4"/>
+              <w:left w:val="single" w:color="C5D5E8" w:sz="4"/>
+              <w:bottom w:val="single" w:color="C5D5E8" w:sz="4"/>
+              <w:right w:val="single" w:color="C5D5E8" w:sz="4"/>
+            </w:tcBorders>
+            <w:shd w:fill="FFFFFF" w:val="clear"/>
+            <w:tcMar>
+              <w:top w:type="dxa" w:w="100"/>
+              <w:left w:type="dxa" w:w="140"/>
+              <w:bottom w:type="dxa" w:w="100"/>
+              <w:right w:type="dxa" w:w="140"/>
+            </w:tcMar>
+            <w:vAlign w:val="top"/>
+          </w:tcPr>
+          <w:p>
+            <w:pPr>
+              <w:jc w:val="center"/>
+            </w:pPr>
+            <w:r>
+              <w:rPr>
+                <w:rFonts w:ascii="Arial" w:cs="Arial" w:eastAsia="Arial" w:hAnsi="Arial"/>
+                <w:b w:val="false"/>
+                <w:bCs w:val="false"/>
+                <w:color w:val="1A1A1A"/>
+                <w:sz w:val="20"/>
+                <w:szCs w:val="20"/>
+              </w:rPr>
+              <w:t xml:space="preserve">1-5</w:t>
+            </w:r>
+          </w:p>
+        </w:tc>
+        <w:tc>
+          <w:tcPr>
+            <w:tcW w:type="dxa" w:w="1480"/>
+            <w:tcBorders>
+              <w:top w:val="single" w:color="C5D5E8" w:sz="4"/>
+              <w:left w:val="single" w:color="C5D5E8" w:sz="4"/>
+              <w:bottom w:val="single" w:color="C5D5E8" w:sz="4"/>
+              <w:right w:val="single" w:color="C5D5E8" w:sz="4"/>
+            </w:tcBorders>
+            <w:shd w:fill="FFFFFF" w:val="clear"/>
+            <w:tcMar>
+              <w:top w:type="dxa" w:w="100"/>
+              <w:left w:type="dxa" w:w="140"/>
+              <w:bottom w:type="dxa" w:w="100"/>
+              <w:right w:type="dxa" w:w="140"/>
+            </w:tcMar>
+            <w:vAlign w:val="top"/>
+          </w:tcPr>
+          <w:p>
+            <w:pPr>
+              <w:jc w:val="left"/>
+            </w:pPr>
+            <w:r>
+              <w:rPr>
+                <w:rFonts w:ascii="Arial" w:cs="Arial" w:eastAsia="Arial" w:hAnsi="Arial"/>
+                <w:b w:val="false"/>
+                <w:bCs w:val="false"/>
+                <w:color w:val="1A1A1A"/>
+                <w:sz w:val="20"/>
+                <w:szCs w:val="20"/>
+              </w:rPr>
+              <w:t xml:space="preserve">Semplicita' percepita</w:t>
+            </w:r>
+          </w:p>
+        </w:tc>
+        <w:tc>
+          <w:tcPr>
+            <w:tcW w:type="dxa" w:w="1000"/>
+            <w:tcBorders>
+              <w:top w:val="single" w:color="C5D5E8" w:sz="4"/>
+              <w:left w:val="single" w:color="C5D5E8" w:sz="4"/>
+              <w:bottom w:val="single" w:color="C5D5E8" w:sz="4"/>
+              <w:right w:val="single" w:color="C5D5E8" w:sz="4"/>
+            </w:tcBorders>
+            <w:shd w:fill="FFFFFF" w:val="clear"/>
+            <w:tcMar>
+              <w:top w:type="dxa" w:w="100"/>
+              <w:left w:type="dxa" w:w="140"/>
+              <w:bottom w:type="dxa" w:w="100"/>
+              <w:right w:type="dxa" w:w="140"/>
+            </w:tcMar>
+            <w:vAlign w:val="top"/>
+          </w:tcPr>
+          <w:p>
+            <w:pPr>
+              <w:jc w:val="left"/>
+            </w:pPr>
+            <w:r>
+              <w:rPr>
+                <w:rFonts w:ascii="Arial" w:cs="Arial" w:eastAsia="Arial" w:hAnsi="Arial"/>
+                <w:b w:val="false"/>
+                <w:bCs w:val="false"/>
+                <w:color w:val="1A1A1A"/>
+                <w:sz w:val="20"/>
+                <w:szCs w:val="20"/>
+              </w:rPr>
+              <w:t xml:space="preserve"/>
+            </w:r>
+          </w:p>
+        </w:tc>
+      </w:tr>
+      <w:tr>
+        <w:tc>
+          <w:tcPr>
+            <w:tcW w:type="dxa" w:w="440"/>
+            <w:tcBorders>
+              <w:top w:val="single" w:color="C5D5E8" w:sz="4"/>
+              <w:left w:val="single" w:color="C5D5E8" w:sz="4"/>
+              <w:bottom w:val="single" w:color="C5D5E8" w:sz="4"/>
+              <w:right w:val="single" w:color="C5D5E8" w:sz="4"/>
+            </w:tcBorders>
+            <w:shd w:fill="F5F5F5" w:val="clear"/>
+            <w:tcMar>
+              <w:top w:type="dxa" w:w="100"/>
+              <w:left w:type="dxa" w:w="140"/>
+              <w:bottom w:type="dxa" w:w="100"/>
+              <w:right w:type="dxa" w:w="140"/>
+            </w:tcMar>
+            <w:vAlign w:val="top"/>
+          </w:tcPr>
+          <w:p>
+            <w:pPr>
+              <w:jc w:val="center"/>
+            </w:pPr>
+            <w:r>
+              <w:rPr>
+                <w:rFonts w:ascii="Arial" w:cs="Arial" w:eastAsia="Arial" w:hAnsi="Arial"/>
+                <w:b/>
+                <w:bCs/>
+                <w:color w:val="1A1A1A"/>
+                <w:sz w:val="20"/>
+                <w:szCs w:val="20"/>
+              </w:rPr>
+              <w:t xml:space="preserve">2</w:t>
+            </w:r>
+          </w:p>
+        </w:tc>
+        <w:tc>
+          <w:tcPr>
+            <w:tcW w:type="dxa" w:w="5106"/>
+            <w:tcBorders>
+              <w:top w:val="single" w:color="C5D5E8" w:sz="4"/>
+              <w:left w:val="single" w:color="C5D5E8" w:sz="4"/>
+              <w:bottom w:val="single" w:color="C5D5E8" w:sz="4"/>
+              <w:right w:val="single" w:color="C5D5E8" w:sz="4"/>
+            </w:tcBorders>
+            <w:shd w:fill="F5F5F5" w:val="clear"/>
+            <w:tcMar>
+              <w:top w:type="dxa" w:w="100"/>
+              <w:left w:type="dxa" w:w="140"/>
+              <w:bottom w:type="dxa" w:w="100"/>
+              <w:right w:type="dxa" w:w="140"/>
+            </w:tcMar>
+            <w:vAlign w:val="top"/>
+          </w:tcPr>
+          <w:p>
+            <w:pPr>
+              <w:jc w:val="left"/>
+            </w:pPr>
+            <w:r>
+              <w:rPr>
+                <w:rFonts w:ascii="Arial" w:cs="Arial" w:eastAsia="Arial" w:hAnsi="Arial"/>
+                <w:b w:val="false"/>
+                <w:bCs w:val="false"/>
+                <w:color w:val="1A1A1A"/>
+                <w:sz w:val="20"/>
+                <w:szCs w:val="20"/>
+              </w:rPr>
+              <w:t xml:space="preserve">La risposta ricevuta era chiara e comprensibile?</w:t>
+            </w:r>
+          </w:p>
+        </w:tc>
+        <w:tc>
+          <w:tcPr>
+            <w:tcW w:type="dxa" w:w="1000"/>
+            <w:tcBorders>
+              <w:top w:val="single" w:color="C5D5E8" w:sz="4"/>
+              <w:left w:val="single" w:color="C5D5E8" w:sz="4"/>
+              <w:bottom w:val="single" w:color="C5D5E8" w:sz="4"/>
+              <w:right w:val="single" w:color="C5D5E8" w:sz="4"/>
+            </w:tcBorders>
+            <w:shd w:fill="F5F5F5" w:val="clear"/>
+            <w:tcMar>
+              <w:top w:type="dxa" w:w="100"/>
+              <w:left w:type="dxa" w:w="140"/>
+              <w:bottom w:type="dxa" w:w="100"/>
+              <w:right w:type="dxa" w:w="140"/>
+            </w:tcMar>
+            <w:vAlign w:val="top"/>
+          </w:tcPr>
+          <w:p>
+            <w:pPr>
+              <w:jc w:val="center"/>
+            </w:pPr>
+            <w:r>
+              <w:rPr>
+                <w:rFonts w:ascii="Arial" w:cs="Arial" w:eastAsia="Arial" w:hAnsi="Arial"/>
+                <w:b w:val="false"/>
+                <w:bCs w:val="false"/>
+                <w:color w:val="1A1A1A"/>
+                <w:sz w:val="20"/>
+                <w:szCs w:val="20"/>
+              </w:rPr>
+              <w:t xml:space="preserve">1-5</w:t>
+            </w:r>
+          </w:p>
+        </w:tc>
+        <w:tc>
+          <w:tcPr>
+            <w:tcW w:type="dxa" w:w="1480"/>
+            <w:tcBorders>
+              <w:top w:val="single" w:color="C5D5E8" w:sz="4"/>
+              <w:left w:val="single" w:color="C5D5E8" w:sz="4"/>
+              <w:bottom w:val="single" w:color="C5D5E8" w:sz="4"/>
+              <w:right w:val="single" w:color="C5D5E8" w:sz="4"/>
+            </w:tcBorders>
+            <w:shd w:fill="F5F5F5" w:val="clear"/>
+            <w:tcMar>
+              <w:top w:type="dxa" w:w="100"/>
+              <w:left w:type="dxa" w:w="140"/>
+              <w:bottom w:type="dxa" w:w="100"/>
+              <w:right w:type="dxa" w:w="140"/>
+            </w:tcMar>
+            <w:vAlign w:val="top"/>
+          </w:tcPr>
+          <w:p>
+            <w:pPr>
+              <w:jc w:val="left"/>
+            </w:pPr>
+            <w:r>
+              <w:rPr>
+                <w:rFonts w:ascii="Arial" w:cs="Arial" w:eastAsia="Arial" w:hAnsi="Arial"/>
+                <w:b w:val="false"/>
+                <w:bCs w:val="false"/>
+                <w:color w:val="1A1A1A"/>
+                <w:sz w:val="20"/>
+                <w:szCs w:val="20"/>
+              </w:rPr>
+              <w:t xml:space="preserve">Soddisfazione</w:t>
+            </w:r>
+          </w:p>
+        </w:tc>
+        <w:tc>
+          <w:tcPr>
+            <w:tcW w:type="dxa" w:w="1000"/>
+            <w:tcBorders>
+              <w:top w:val="single" w:color="C5D5E8" w:sz="4"/>
+              <w:left w:val="single" w:color="C5D5E8" w:sz="4"/>
+              <w:bottom w:val="single" w:color="C5D5E8" w:sz="4"/>
+              <w:right w:val="single" w:color="C5D5E8" w:sz="4"/>
+            </w:tcBorders>
+            <w:shd w:fill="F5F5F5" w:val="clear"/>
+            <w:tcMar>
+              <w:top w:type="dxa" w:w="100"/>
+              <w:left w:type="dxa" w:w="140"/>
+              <w:bottom w:type="dxa" w:w="100"/>
+              <w:right w:type="dxa" w:w="140"/>
+            </w:tcMar>
+            <w:vAlign w:val="top"/>
+          </w:tcPr>
+          <w:p>
+            <w:pPr>
+              <w:jc w:val="left"/>
+            </w:pPr>
+            <w:r>
+              <w:rPr>
+                <w:rFonts w:ascii="Arial" w:cs="Arial" w:eastAsia="Arial" w:hAnsi="Arial"/>
+                <w:b w:val="false"/>
+                <w:bCs w:val="false"/>
+                <w:color w:val="1A1A1A"/>
+                <w:sz w:val="20"/>
+                <w:szCs w:val="20"/>
+              </w:rPr>
+              <w:t xml:space="preserve"/>
+            </w:r>
+          </w:p>
+        </w:tc>
+      </w:tr>
+      <w:tr>
+        <w:tc>
+          <w:tcPr>
+            <w:tcW w:type="dxa" w:w="440"/>
+            <w:tcBorders>
+              <w:top w:val="single" w:color="C5D5E8" w:sz="4"/>
+              <w:left w:val="single" w:color="C5D5E8" w:sz="4"/>
+              <w:bottom w:val="single" w:color="C5D5E8" w:sz="4"/>
+              <w:right w:val="single" w:color="C5D5E8" w:sz="4"/>
+            </w:tcBorders>
+            <w:shd w:fill="FFFFFF" w:val="clear"/>
+            <w:tcMar>
+              <w:top w:type="dxa" w:w="100"/>
+              <w:left w:type="dxa" w:w="140"/>
+              <w:bottom w:type="dxa" w:w="100"/>
+              <w:right w:type="dxa" w:w="140"/>
+            </w:tcMar>
+            <w:vAlign w:val="top"/>
+          </w:tcPr>
+          <w:p>
+            <w:pPr>
+              <w:jc w:val="center"/>
+            </w:pPr>
+            <w:r>
+              <w:rPr>
+                <w:rFonts w:ascii="Arial" w:cs="Arial" w:eastAsia="Arial" w:hAnsi="Arial"/>
+                <w:b/>
+                <w:bCs/>
+                <w:color w:val="1A1A1A"/>
+                <w:sz w:val="20"/>
+                <w:szCs w:val="20"/>
+              </w:rPr>
+              <w:t xml:space="preserve">3</w:t>
+            </w:r>
+          </w:p>
+        </w:tc>
+        <w:tc>
+          <w:tcPr>
+            <w:tcW w:type="dxa" w:w="5106"/>
+            <w:tcBorders>
+              <w:top w:val="single" w:color="C5D5E8" w:sz="4"/>
+              <w:left w:val="single" w:color="C5D5E8" w:sz="4"/>
+              <w:bottom w:val="single" w:color="C5D5E8" w:sz="4"/>
+              <w:right w:val="single" w:color="C5D5E8" w:sz="4"/>
+            </w:tcBorders>
+            <w:shd w:fill="FFFFFF" w:val="clear"/>
+            <w:tcMar>
+              <w:top w:type="dxa" w:w="100"/>
+              <w:left w:type="dxa" w:w="140"/>
+              <w:bottom w:type="dxa" w:w="100"/>
+              <w:right w:type="dxa" w:w="140"/>
+            </w:tcMar>
+            <w:vAlign w:val="top"/>
+          </w:tcPr>
+          <w:p>
+            <w:pPr>
+              <w:jc w:val="left"/>
+            </w:pPr>
+            <w:r>
+              <w:rPr>
+                <w:rFonts w:ascii="Arial" w:cs="Arial" w:eastAsia="Arial" w:hAnsi="Arial"/>
+                <w:b w:val="false"/>
+                <w:bCs w:val="false"/>
+                <w:color w:val="1A1A1A"/>
+                <w:sz w:val="20"/>
+                <w:szCs w:val="20"/>
+              </w:rPr>
+              <w:t xml:space="preserve">La risposta era pertinente alla domanda che avevi fatto?</w:t>
+            </w:r>
+          </w:p>
+        </w:tc>
+        <w:tc>
+          <w:tcPr>
+            <w:tcW w:type="dxa" w:w="1000"/>
+            <w:tcBorders>
+              <w:top w:val="single" w:color="C5D5E8" w:sz="4"/>
+              <w:left w:val="single" w:color="C5D5E8" w:sz="4"/>
+              <w:bottom w:val="single" w:color="C5D5E8" w:sz="4"/>
+              <w:right w:val="single" w:color="C5D5E8" w:sz="4"/>
+            </w:tcBorders>
+            <w:shd w:fill="FFFFFF" w:val="clear"/>
+            <w:tcMar>
+              <w:top w:type="dxa" w:w="100"/>
+              <w:left w:type="dxa" w:w="140"/>
+              <w:bottom w:type="dxa" w:w="100"/>
+              <w:right w:type="dxa" w:w="140"/>
+            </w:tcMar>
+            <w:vAlign w:val="top"/>
+          </w:tcPr>
+          <w:p>
+            <w:pPr>
+              <w:jc w:val="center"/>
+            </w:pPr>
+            <w:r>
+              <w:rPr>
+                <w:rFonts w:ascii="Arial" w:cs="Arial" w:eastAsia="Arial" w:hAnsi="Arial"/>
+                <w:b w:val="false"/>
+                <w:bCs w:val="false"/>
+                <w:color w:val="1A1A1A"/>
+                <w:sz w:val="20"/>
+                <w:szCs w:val="20"/>
+              </w:rPr>
+              <w:t xml:space="preserve">1-5</w:t>
+            </w:r>
+          </w:p>
+        </w:tc>
+        <w:tc>
+          <w:tcPr>
+            <w:tcW w:type="dxa" w:w="1480"/>
+            <w:tcBorders>
+              <w:top w:val="single" w:color="C5D5E8" w:sz="4"/>
+              <w:left w:val="single" w:color="C5D5E8" w:sz="4"/>
+              <w:bottom w:val="single" w:color="C5D5E8" w:sz="4"/>
+              <w:right w:val="single" w:color="C5D5E8" w:sz="4"/>
+            </w:tcBorders>
+            <w:shd w:fill="FFFFFF" w:val="clear"/>
+            <w:tcMar>
+              <w:top w:type="dxa" w:w="100"/>
+              <w:left w:type="dxa" w:w="140"/>
+              <w:bottom w:type="dxa" w:w="100"/>
+              <w:right w:type="dxa" w:w="140"/>
+            </w:tcMar>
+            <w:vAlign w:val="top"/>
+          </w:tcPr>
+          <w:p>
+            <w:pPr>
+              <w:jc w:val="left"/>
+            </w:pPr>
+            <w:r>
+              <w:rPr>
+                <w:rFonts w:ascii="Arial" w:cs="Arial" w:eastAsia="Arial" w:hAnsi="Arial"/>
+                <w:b w:val="false"/>
+                <w:bCs w:val="false"/>
+                <w:color w:val="1A1A1A"/>
+                <w:sz w:val="20"/>
+                <w:szCs w:val="20"/>
+              </w:rPr>
+              <w:t xml:space="preserve">Qualita' risposta AI</w:t>
+            </w:r>
+          </w:p>
+        </w:tc>
+        <w:tc>
+          <w:tcPr>
+            <w:tcW w:type="dxa" w:w="1000"/>
+            <w:tcBorders>
+              <w:top w:val="single" w:color="C5D5E8" w:sz="4"/>
+              <w:left w:val="single" w:color="C5D5E8" w:sz="4"/>
+              <w:bottom w:val="single" w:color="C5D5E8" w:sz="4"/>
+              <w:right w:val="single" w:color="C5D5E8" w:sz="4"/>
+            </w:tcBorders>
+            <w:shd w:fill="FFFFFF" w:val="clear"/>
+            <w:tcMar>
+              <w:top w:type="dxa" w:w="100"/>
+              <w:left w:type="dxa" w:w="140"/>
+              <w:bottom w:type="dxa" w:w="100"/>
+              <w:right w:type="dxa" w:w="140"/>
+            </w:tcMar>
+            <w:vAlign w:val="top"/>
+          </w:tcPr>
+          <w:p>
+            <w:pPr>
+              <w:jc w:val="left"/>
+            </w:pPr>
+            <w:r>
+              <w:rPr>
+                <w:rFonts w:ascii="Arial" w:cs="Arial" w:eastAsia="Arial" w:hAnsi="Arial"/>
+                <w:b w:val="false"/>
+                <w:bCs w:val="false"/>
+                <w:color w:val="1A1A1A"/>
+                <w:sz w:val="20"/>
+                <w:szCs w:val="20"/>
+              </w:rPr>
+              <w:t xml:space="preserve"/>
+            </w:r>
+          </w:p>
+        </w:tc>
+      </w:tr>
+      <w:tr>
+        <w:tc>
+          <w:tcPr>
+            <w:tcW w:type="dxa" w:w="440"/>
+            <w:tcBorders>
+              <w:top w:val="single" w:color="C5D5E8" w:sz="4"/>
+              <w:left w:val="single" w:color="C5D5E8" w:sz="4"/>
+              <w:bottom w:val="single" w:color="C5D5E8" w:sz="4"/>
+              <w:right w:val="single" w:color="C5D5E8" w:sz="4"/>
+            </w:tcBorders>
+            <w:shd w:fill="F5F5F5" w:val="clear"/>
+            <w:tcMar>
+              <w:top w:type="dxa" w:w="100"/>
+              <w:left w:type="dxa" w:w="140"/>
+              <w:bottom w:type="dxa" w:w="100"/>
+              <w:right w:type="dxa" w:w="140"/>
+            </w:tcMar>
+            <w:vAlign w:val="top"/>
+          </w:tcPr>
+          <w:p>
+            <w:pPr>
+              <w:jc w:val="center"/>
+            </w:pPr>
+            <w:r>
+              <w:rPr>
+                <w:rFonts w:ascii="Arial" w:cs="Arial" w:eastAsia="Arial" w:hAnsi="Arial"/>
+                <w:b/>
+                <w:bCs/>
+                <w:color w:val="1A1A1A"/>
+                <w:sz w:val="20"/>
+                <w:szCs w:val="20"/>
+              </w:rPr>
+              <w:t xml:space="preserve">4</w:t>
+            </w:r>
+          </w:p>
+        </w:tc>
+        <w:tc>
+          <w:tcPr>
+            <w:tcW w:type="dxa" w:w="5106"/>
+            <w:tcBorders>
+              <w:top w:val="single" w:color="C5D5E8" w:sz="4"/>
+              <w:left w:val="single" w:color="C5D5E8" w:sz="4"/>
+              <w:bottom w:val="single" w:color="C5D5E8" w:sz="4"/>
+              <w:right w:val="single" w:color="C5D5E8" w:sz="4"/>
+            </w:tcBorders>
+            <w:shd w:fill="F5F5F5" w:val="clear"/>
+            <w:tcMar>
+              <w:top w:type="dxa" w:w="100"/>
+              <w:left w:type="dxa" w:w="140"/>
+              <w:bottom w:type="dxa" w:w="100"/>
+              <w:right w:type="dxa" w:w="140"/>
+            </w:tcMar>
+            <w:vAlign w:val="top"/>
+          </w:tcPr>
+          <w:p>
+            <w:pPr>
+              <w:jc w:val="left"/>
+            </w:pPr>
+            <w:r>
+              <w:rPr>
+                <w:rFonts w:ascii="Arial" w:cs="Arial" w:eastAsia="Arial" w:hAnsi="Arial"/>
+                <w:b w:val="false"/>
+                <w:bCs w:val="false"/>
+                <w:color w:val="1A1A1A"/>
+                <w:sz w:val="20"/>
+                <w:szCs w:val="20"/>
+              </w:rPr>
+              <w:t xml:space="preserve">Se la risposta non era disponibile subito, hai capito che la richiesta sarebbe arrivata all'amministratore?</w:t>
+            </w:r>
+          </w:p>
+        </w:tc>
+        <w:tc>
+          <w:tcPr>
+            <w:tcW w:type="dxa" w:w="1000"/>
+            <w:tcBorders>
+              <w:top w:val="single" w:color="C5D5E8" w:sz="4"/>
+              <w:left w:val="single" w:color="C5D5E8" w:sz="4"/>
+              <w:bottom w:val="single" w:color="C5D5E8" w:sz="4"/>
+              <w:right w:val="single" w:color="C5D5E8" w:sz="4"/>
+            </w:tcBorders>
+            <w:shd w:fill="F5F5F5" w:val="clear"/>
+            <w:tcMar>
+              <w:top w:type="dxa" w:w="100"/>
+              <w:left w:type="dxa" w:w="140"/>
+              <w:bottom w:type="dxa" w:w="100"/>
+              <w:right w:type="dxa" w:w="140"/>
+            </w:tcMar>
+            <w:vAlign w:val="top"/>
+          </w:tcPr>
+          <w:p>
+            <w:pPr>
+              <w:jc w:val="center"/>
+            </w:pPr>
+            <w:r>
+              <w:rPr>
+                <w:rFonts w:ascii="Arial" w:cs="Arial" w:eastAsia="Arial" w:hAnsi="Arial"/>
+                <w:b w:val="false"/>
+                <w:bCs w:val="false"/>
+                <w:color w:val="1A1A1A"/>
+                <w:sz w:val="20"/>
+                <w:szCs w:val="20"/>
+              </w:rPr>
+              <w:t xml:space="preserve">1-5</w:t>
+            </w:r>
+          </w:p>
+        </w:tc>
+        <w:tc>
+          <w:tcPr>
+            <w:tcW w:type="dxa" w:w="1480"/>
+            <w:tcBorders>
+              <w:top w:val="single" w:color="C5D5E8" w:sz="4"/>
+              <w:left w:val="single" w:color="C5D5E8" w:sz="4"/>
+              <w:bottom w:val="single" w:color="C5D5E8" w:sz="4"/>
+              <w:right w:val="single" w:color="C5D5E8" w:sz="4"/>
+            </w:tcBorders>
+            <w:shd w:fill="F5F5F5" w:val="clear"/>
+            <w:tcMar>
+              <w:top w:type="dxa" w:w="100"/>
+              <w:left w:type="dxa" w:w="140"/>
+              <w:bottom w:type="dxa" w:w="100"/>
+              <w:right w:type="dxa" w:w="140"/>
+            </w:tcMar>
+            <w:vAlign w:val="top"/>
+          </w:tcPr>
+          <w:p>
+            <w:pPr>
+              <w:jc w:val="left"/>
+            </w:pPr>
+            <w:r>
+              <w:rPr>
+                <w:rFonts w:ascii="Arial" w:cs="Arial" w:eastAsia="Arial" w:hAnsi="Arial"/>
+                <w:b w:val="false"/>
+                <w:bCs w:val="false"/>
+                <w:color w:val="1A1A1A"/>
+                <w:sz w:val="20"/>
+                <w:szCs w:val="20"/>
+              </w:rPr>
+              <w:t xml:space="preserve">Trasparenza escalation</w:t>
+            </w:r>
+          </w:p>
+        </w:tc>
+        <w:tc>
+          <w:tcPr>
+            <w:tcW w:type="dxa" w:w="1000"/>
+            <w:tcBorders>
+              <w:top w:val="single" w:color="C5D5E8" w:sz="4"/>
+              <w:left w:val="single" w:color="C5D5E8" w:sz="4"/>
+              <w:bottom w:val="single" w:color="C5D5E8" w:sz="4"/>
+              <w:right w:val="single" w:color="C5D5E8" w:sz="4"/>
+            </w:tcBorders>
+            <w:shd w:fill="F5F5F5" w:val="clear"/>
+            <w:tcMar>
+              <w:top w:type="dxa" w:w="100"/>
+              <w:left w:type="dxa" w:w="140"/>
+              <w:bottom w:type="dxa" w:w="100"/>
+              <w:right w:type="dxa" w:w="140"/>
+            </w:tcMar>
+            <w:vAlign w:val="top"/>
+          </w:tcPr>
+          <w:p>
+            <w:pPr>
+              <w:jc w:val="left"/>
+            </w:pPr>
+            <w:r>
+              <w:rPr>
+                <w:rFonts w:ascii="Arial" w:cs="Arial" w:eastAsia="Arial" w:hAnsi="Arial"/>
+                <w:b w:val="false"/>
+                <w:bCs w:val="false"/>
+                <w:color w:val="1A1A1A"/>
+                <w:sz w:val="20"/>
+                <w:szCs w:val="20"/>
+              </w:rPr>
+              <w:t xml:space="preserve"/>
+            </w:r>
+          </w:p>
+        </w:tc>
+      </w:tr>
+      <w:tr>
+        <w:tc>
+          <w:tcPr>
+            <w:tcW w:type="dxa" w:w="440"/>
+            <w:tcBorders>
+              <w:top w:val="single" w:color="C5D5E8" w:sz="4"/>
+              <w:left w:val="single" w:color="C5D5E8" w:sz="4"/>
+              <w:bottom w:val="single" w:color="C5D5E8" w:sz="4"/>
+              <w:right w:val="single" w:color="C5D5E8" w:sz="4"/>
+            </w:tcBorders>
+            <w:shd w:fill="FFFFFF" w:val="clear"/>
+            <w:tcMar>
+              <w:top w:type="dxa" w:w="100"/>
+              <w:left w:type="dxa" w:w="140"/>
+              <w:bottom w:type="dxa" w:w="100"/>
+              <w:right w:type="dxa" w:w="140"/>
+            </w:tcMar>
+            <w:vAlign w:val="top"/>
+          </w:tcPr>
+          <w:p>
+            <w:pPr>
+              <w:jc w:val="center"/>
+            </w:pPr>
+            <w:r>
+              <w:rPr>
+                <w:rFonts w:ascii="Arial" w:cs="Arial" w:eastAsia="Arial" w:hAnsi="Arial"/>
+                <w:b/>
+                <w:bCs/>
+                <w:color w:val="1A1A1A"/>
+                <w:sz w:val="20"/>
+                <w:szCs w:val="20"/>
+              </w:rPr>
+              <w:t xml:space="preserve">5</w:t>
+            </w:r>
+          </w:p>
+        </w:tc>
+        <w:tc>
+          <w:tcPr>
+            <w:tcW w:type="dxa" w:w="5106"/>
+            <w:tcBorders>
+              <w:top w:val="single" w:color="C5D5E8" w:sz="4"/>
+              <w:left w:val="single" w:color="C5D5E8" w:sz="4"/>
+              <w:bottom w:val="single" w:color="C5D5E8" w:sz="4"/>
+              <w:right w:val="single" w:color="C5D5E8" w:sz="4"/>
+            </w:tcBorders>
+            <w:shd w:fill="FFFFFF" w:val="clear"/>
+            <w:tcMar>
+              <w:top w:type="dxa" w:w="100"/>
+              <w:left w:type="dxa" w:w="140"/>
+              <w:bottom w:type="dxa" w:w="100"/>
+              <w:right w:type="dxa" w:w="140"/>
+            </w:tcMar>
+            <w:vAlign w:val="top"/>
+          </w:tcPr>
+          <w:p>
+            <w:pPr>
+              <w:jc w:val="left"/>
+            </w:pPr>
+            <w:r>
+              <w:rPr>
+                <w:rFonts w:ascii="Arial" w:cs="Arial" w:eastAsia="Arial" w:hAnsi="Arial"/>
+                <w:b w:val="false"/>
+                <w:bCs w:val="false"/>
+                <w:color w:val="1A1A1A"/>
+                <w:sz w:val="20"/>
+                <w:szCs w:val="20"/>
+              </w:rPr>
+              <w:t xml:space="preserve">Useresti questo sistema autonomamente la prossima volta, senza assistenza?</w:t>
+            </w:r>
+          </w:p>
+        </w:tc>
+        <w:tc>
+          <w:tcPr>
+            <w:tcW w:type="dxa" w:w="1000"/>
+            <w:tcBorders>
+              <w:top w:val="single" w:color="C5D5E8" w:sz="4"/>
+              <w:left w:val="single" w:color="C5D5E8" w:sz="4"/>
+              <w:bottom w:val="single" w:color="C5D5E8" w:sz="4"/>
+              <w:right w:val="single" w:color="C5D5E8" w:sz="4"/>
+            </w:tcBorders>
+            <w:shd w:fill="FFFFFF" w:val="clear"/>
+            <w:tcMar>
+              <w:top w:type="dxa" w:w="100"/>
+              <w:left w:type="dxa" w:w="140"/>
+              <w:bottom w:type="dxa" w:w="100"/>
+              <w:right w:type="dxa" w:w="140"/>
+            </w:tcMar>
+            <w:vAlign w:val="top"/>
+          </w:tcPr>
+          <w:p>
+            <w:pPr>
+              <w:jc w:val="center"/>
+            </w:pPr>
+            <w:r>
+              <w:rPr>
+                <w:rFonts w:ascii="Arial" w:cs="Arial" w:eastAsia="Arial" w:hAnsi="Arial"/>
+                <w:b w:val="false"/>
+                <w:bCs w:val="false"/>
+                <w:color w:val="1A1A1A"/>
+                <w:sz w:val="20"/>
+                <w:szCs w:val="20"/>
+              </w:rPr>
+              <w:t xml:space="preserve">Si / No</w:t>
+            </w:r>
+          </w:p>
+        </w:tc>
+        <w:tc>
+          <w:tcPr>
+            <w:tcW w:type="dxa" w:w="1480"/>
+            <w:tcBorders>
+              <w:top w:val="single" w:color="C5D5E8" w:sz="4"/>
+              <w:left w:val="single" w:color="C5D5E8" w:sz="4"/>
+              <w:bottom w:val="single" w:color="C5D5E8" w:sz="4"/>
+              <w:right w:val="single" w:color="C5D5E8" w:sz="4"/>
+            </w:tcBorders>
+            <w:shd w:fill="FFFFFF" w:val="clear"/>
+            <w:tcMar>
+              <w:top w:type="dxa" w:w="100"/>
+              <w:left w:type="dxa" w:w="140"/>
+              <w:bottom w:type="dxa" w:w="100"/>
+              <w:right w:type="dxa" w:w="140"/>
+            </w:tcMar>
+            <w:vAlign w:val="top"/>
+          </w:tcPr>
+          <w:p>
+            <w:pPr>
+              <w:jc w:val="left"/>
+            </w:pPr>
+            <w:r>
+              <w:rPr>
+                <w:rFonts w:ascii="Arial" w:cs="Arial" w:eastAsia="Arial" w:hAnsi="Arial"/>
+                <w:b w:val="false"/>
+                <w:bCs w:val="false"/>
+                <w:color w:val="1A1A1A"/>
+                <w:sz w:val="20"/>
+                <w:szCs w:val="20"/>
+              </w:rPr>
+              <w:t xml:space="preserve">Adozione reale</w:t>
+            </w:r>
+          </w:p>
+        </w:tc>
+        <w:tc>
+          <w:tcPr>
+            <w:tcW w:type="dxa" w:w="1000"/>
+            <w:tcBorders>
+              <w:top w:val="single" w:color="C5D5E8" w:sz="4"/>
+              <w:left w:val="single" w:color="C5D5E8" w:sz="4"/>
+              <w:bottom w:val="single" w:color="C5D5E8" w:sz="4"/>
+              <w:right w:val="single" w:color="C5D5E8" w:sz="4"/>
+            </w:tcBorders>
+            <w:shd w:fill="FFFFFF" w:val="clear"/>
+            <w:tcMar>
+              <w:top w:type="dxa" w:w="100"/>
+              <w:left w:type="dxa" w:w="140"/>
+              <w:bottom w:type="dxa" w:w="100"/>
+              <w:right w:type="dxa" w:w="140"/>
+            </w:tcMar>
+            <w:vAlign w:val="top"/>
+          </w:tcPr>
+          <w:p>
+            <w:pPr>
+              <w:jc w:val="left"/>
+            </w:pPr>
+            <w:r>
+              <w:rPr>
+                <w:rFonts w:ascii="Arial" w:cs="Arial" w:eastAsia="Arial" w:hAnsi="Arial"/>
+                <w:b w:val="false"/>
+                <w:bCs w:val="false"/>
+                <w:color w:val="1A1A1A"/>
+                <w:sz w:val="20"/>
+                <w:szCs w:val="20"/>
+              </w:rPr>
+              <w:t xml:space="preserve"/>
+            </w:r>
+          </w:p>
+        </w:tc>
+      </w:tr>
+      <w:tr>
+        <w:tc>
+          <w:tcPr>
+            <w:tcW w:type="dxa" w:w="440"/>
+            <w:tcBorders>
+              <w:top w:val="single" w:color="C5D5E8" w:sz="4"/>
+              <w:left w:val="single" w:color="C5D5E8" w:sz="4"/>
+              <w:bottom w:val="single" w:color="C5D5E8" w:sz="4"/>
+              <w:right w:val="single" w:color="C5D5E8" w:sz="4"/>
+            </w:tcBorders>
+            <w:shd w:fill="F5F5F5" w:val="clear"/>
+            <w:tcMar>
+              <w:top w:type="dxa" w:w="100"/>
+              <w:left w:type="dxa" w:w="140"/>
+              <w:bottom w:type="dxa" w:w="100"/>
+              <w:right w:type="dxa" w:w="140"/>
+            </w:tcMar>
+            <w:vAlign w:val="top"/>
+          </w:tcPr>
+          <w:p>
+            <w:pPr>
+              <w:jc w:val="center"/>
+            </w:pPr>
+            <w:r>
+              <w:rPr>
+                <w:rFonts w:ascii="Arial" w:cs="Arial" w:eastAsia="Arial" w:hAnsi="Arial"/>
+                <w:b/>
+                <w:bCs/>
+                <w:color w:val="1A1A1A"/>
+                <w:sz w:val="20"/>
+                <w:szCs w:val="20"/>
+              </w:rPr>
+              <w:t xml:space="preserve">6</w:t>
+            </w:r>
+          </w:p>
+        </w:tc>
+        <w:tc>
+          <w:tcPr>
+            <w:tcW w:type="dxa" w:w="5106"/>
+            <w:tcBorders>
+              <w:top w:val="single" w:color="C5D5E8" w:sz="4"/>
+              <w:left w:val="single" w:color="C5D5E8" w:sz="4"/>
+              <w:bottom w:val="single" w:color="C5D5E8" w:sz="4"/>
+              <w:right w:val="single" w:color="C5D5E8" w:sz="4"/>
+            </w:tcBorders>
+            <w:shd w:fill="F5F5F5" w:val="clear"/>
+            <w:tcMar>
+              <w:top w:type="dxa" w:w="100"/>
+              <w:left w:type="dxa" w:w="140"/>
+              <w:bottom w:type="dxa" w:w="100"/>
+              <w:right w:type="dxa" w:w="140"/>
+            </w:tcMar>
+            <w:vAlign w:val="top"/>
+          </w:tcPr>
+          <w:p>
+            <w:pPr>
+              <w:jc w:val="left"/>
+            </w:pPr>
+            <w:r>
+              <w:rPr>
+                <w:rFonts w:ascii="Arial" w:cs="Arial" w:eastAsia="Arial" w:hAnsi="Arial"/>
+                <w:b w:val="false"/>
+                <w:bCs w:val="false"/>
+                <w:color w:val="1A1A1A"/>
+                <w:sz w:val="20"/>
+                <w:szCs w:val="20"/>
+              </w:rPr>
+              <w:t xml:space="preserve">Preferiresti usare questa chat rispetto a chiamare o scrivere un'email all'amministratore?</w:t>
+            </w:r>
+          </w:p>
+        </w:tc>
+        <w:tc>
+          <w:tcPr>
+            <w:tcW w:type="dxa" w:w="1000"/>
+            <w:tcBorders>
+              <w:top w:val="single" w:color="C5D5E8" w:sz="4"/>
+              <w:left w:val="single" w:color="C5D5E8" w:sz="4"/>
+              <w:bottom w:val="single" w:color="C5D5E8" w:sz="4"/>
+              <w:right w:val="single" w:color="C5D5E8" w:sz="4"/>
+            </w:tcBorders>
+            <w:shd w:fill="F5F5F5" w:val="clear"/>
+            <w:tcMar>
+              <w:top w:type="dxa" w:w="100"/>
+              <w:left w:type="dxa" w:w="140"/>
+              <w:bottom w:type="dxa" w:w="100"/>
+              <w:right w:type="dxa" w:w="140"/>
+            </w:tcMar>
+            <w:vAlign w:val="top"/>
+          </w:tcPr>
+          <w:p>
+            <w:pPr>
+              <w:jc w:val="center"/>
+            </w:pPr>
+            <w:r>
+              <w:rPr>
+                <w:rFonts w:ascii="Arial" w:cs="Arial" w:eastAsia="Arial" w:hAnsi="Arial"/>
+                <w:b w:val="false"/>
+                <w:bCs w:val="false"/>
+                <w:color w:val="1A1A1A"/>
+                <w:sz w:val="20"/>
+                <w:szCs w:val="20"/>
+              </w:rPr>
+              <w:t xml:space="preserve">Si / No / Dipende</w:t>
+            </w:r>
+          </w:p>
+        </w:tc>
+        <w:tc>
+          <w:tcPr>
+            <w:tcW w:type="dxa" w:w="1480"/>
+            <w:tcBorders>
+              <w:top w:val="single" w:color="C5D5E8" w:sz="4"/>
+              <w:left w:val="single" w:color="C5D5E8" w:sz="4"/>
+              <w:bottom w:val="single" w:color="C5D5E8" w:sz="4"/>
+              <w:right w:val="single" w:color="C5D5E8" w:sz="4"/>
+            </w:tcBorders>
+            <w:shd w:fill="F5F5F5" w:val="clear"/>
+            <w:tcMar>
+              <w:top w:type="dxa" w:w="100"/>
+              <w:left w:type="dxa" w:w="140"/>
+              <w:bottom w:type="dxa" w:w="100"/>
+              <w:right w:type="dxa" w:w="140"/>
+            </w:tcMar>
+            <w:vAlign w:val="top"/>
+          </w:tcPr>
+          <w:p>
+            <w:pPr>
+              <w:jc w:val="left"/>
+            </w:pPr>
+            <w:r>
+              <w:rPr>
+                <w:rFonts w:ascii="Arial" w:cs="Arial" w:eastAsia="Arial" w:hAnsi="Arial"/>
+                <w:b w:val="false"/>
+                <w:bCs w:val="false"/>
+                <w:color w:val="1A1A1A"/>
+                <w:sz w:val="20"/>
+                <w:szCs w:val="20"/>
+              </w:rPr>
+              <w:t xml:space="preserve">Preferenza canale</w:t>
+            </w:r>
+          </w:p>
+        </w:tc>
+        <w:tc>
+          <w:tcPr>
+            <w:tcW w:type="dxa" w:w="1000"/>
+            <w:tcBorders>
+              <w:top w:val="single" w:color="C5D5E8" w:sz="4"/>
+              <w:left w:val="single" w:color="C5D5E8" w:sz="4"/>
+              <w:bottom w:val="single" w:color="C5D5E8" w:sz="4"/>
+              <w:right w:val="single" w:color="C5D5E8" w:sz="4"/>
+            </w:tcBorders>
+            <w:shd w:fill="F5F5F5" w:val="clear"/>
+            <w:tcMar>
+              <w:top w:type="dxa" w:w="100"/>
+              <w:left w:type="dxa" w:w="140"/>
+              <w:bottom w:type="dxa" w:w="100"/>
+              <w:right w:type="dxa" w:w="140"/>
+            </w:tcMar>
+            <w:vAlign w:val="top"/>
+          </w:tcPr>
+          <w:p>
+            <w:pPr>
+              <w:jc w:val="left"/>
+            </w:pPr>
+            <w:r>
+              <w:rPr>
+                <w:rFonts w:ascii="Arial" w:cs="Arial" w:eastAsia="Arial" w:hAnsi="Arial"/>
+                <w:b w:val="false"/>
+                <w:bCs w:val="false"/>
+                <w:color w:val="1A1A1A"/>
+                <w:sz w:val="20"/>
+                <w:szCs w:val="20"/>
+              </w:rPr>
+              <w:t xml:space="preserve"/>
+            </w:r>
+          </w:p>
+        </w:tc>
+      </w:tr>
+      <w:tr>
+        <w:tc>
+          <w:tcPr>
+            <w:tcW w:type="dxa" w:w="440"/>
+            <w:tcBorders>
+              <w:top w:val="single" w:color="C5D5E8" w:sz="4"/>
+              <w:left w:val="single" w:color="C5D5E8" w:sz="4"/>
+              <w:bottom w:val="single" w:color="C5D5E8" w:sz="4"/>
+              <w:right w:val="single" w:color="C5D5E8" w:sz="4"/>
+            </w:tcBorders>
+            <w:shd w:fill="FFFFFF" w:val="clear"/>
+            <w:tcMar>
+              <w:top w:type="dxa" w:w="100"/>
+              <w:left w:type="dxa" w:w="140"/>
+              <w:bottom w:type="dxa" w:w="100"/>
+              <w:right w:type="dxa" w:w="140"/>
+            </w:tcMar>
+            <w:vAlign w:val="top"/>
+          </w:tcPr>
+          <w:p>
+            <w:pPr>
+              <w:jc w:val="center"/>
+            </w:pPr>
+            <w:r>
+              <w:rPr>
+                <w:rFonts w:ascii="Arial" w:cs="Arial" w:eastAsia="Arial" w:hAnsi="Arial"/>
+                <w:b/>
+                <w:bCs/>
+                <w:color w:val="1A1A1A"/>
+                <w:sz w:val="20"/>
+                <w:szCs w:val="20"/>
+              </w:rPr>
+              <w:t xml:space="preserve">7</w:t>
+            </w:r>
+          </w:p>
+        </w:tc>
+        <w:tc>
+          <w:tcPr>
+            <w:tcW w:type="dxa" w:w="5106"/>
+            <w:tcBorders>
+              <w:top w:val="single" w:color="C5D5E8" w:sz="4"/>
+              <w:left w:val="single" w:color="C5D5E8" w:sz="4"/>
+              <w:bottom w:val="single" w:color="C5D5E8" w:sz="4"/>
+              <w:right w:val="single" w:color="C5D5E8" w:sz="4"/>
+            </w:tcBorders>
+            <w:shd w:fill="FFFFFF" w:val="clear"/>
+            <w:tcMar>
+              <w:top w:type="dxa" w:w="100"/>
+              <w:left w:type="dxa" w:w="140"/>
+              <w:bottom w:type="dxa" w:w="100"/>
+              <w:right w:type="dxa" w:w="140"/>
+            </w:tcMar>
+            <w:vAlign w:val="top"/>
+          </w:tcPr>
+          <w:p>
+            <w:pPr>
+              <w:jc w:val="left"/>
+            </w:pPr>
+            <w:r>
+              <w:rPr>
+                <w:rFonts w:ascii="Arial" w:cs="Arial" w:eastAsia="Arial" w:hAnsi="Arial"/>
+                <w:b w:val="false"/>
+                <w:bCs w:val="false"/>
+                <w:color w:val="1A1A1A"/>
+                <w:sz w:val="20"/>
+                <w:szCs w:val="20"/>
+              </w:rPr>
+              <w:t xml:space="preserve">C'e' qualcosa che non ha funzionato come ti aspettavi? Se si, cosa?</w:t>
+            </w:r>
+          </w:p>
+        </w:tc>
+        <w:tc>
+          <w:tcPr>
+            <w:tcW w:type="dxa" w:w="1000"/>
+            <w:tcBorders>
+              <w:top w:val="single" w:color="C5D5E8" w:sz="4"/>
+              <w:left w:val="single" w:color="C5D5E8" w:sz="4"/>
+              <w:bottom w:val="single" w:color="C5D5E8" w:sz="4"/>
+              <w:right w:val="single" w:color="C5D5E8" w:sz="4"/>
+            </w:tcBorders>
+            <w:shd w:fill="FFFFFF" w:val="clear"/>
+            <w:tcMar>
+              <w:top w:type="dxa" w:w="100"/>
+              <w:left w:type="dxa" w:w="140"/>
+              <w:bottom w:type="dxa" w:w="100"/>
+              <w:right w:type="dxa" w:w="140"/>
+            </w:tcMar>
+            <w:vAlign w:val="top"/>
+          </w:tcPr>
+          <w:p>
+            <w:pPr>
+              <w:jc w:val="center"/>
+            </w:pPr>
+            <w:r>
+              <w:rPr>
+                <w:rFonts w:ascii="Arial" w:cs="Arial" w:eastAsia="Arial" w:hAnsi="Arial"/>
+                <w:b w:val="false"/>
+                <w:bCs w:val="false"/>
+                <w:color w:val="1A1A1A"/>
+                <w:sz w:val="20"/>
+                <w:szCs w:val="20"/>
+              </w:rPr>
+              <w:t xml:space="preserve">Aperta</w:t>
+            </w:r>
+          </w:p>
+        </w:tc>
+        <w:tc>
+          <w:tcPr>
+            <w:tcW w:type="dxa" w:w="1480"/>
+            <w:tcBorders>
+              <w:top w:val="single" w:color="C5D5E8" w:sz="4"/>
+              <w:left w:val="single" w:color="C5D5E8" w:sz="4"/>
+              <w:bottom w:val="single" w:color="C5D5E8" w:sz="4"/>
+              <w:right w:val="single" w:color="C5D5E8" w:sz="4"/>
+            </w:tcBorders>
+            <w:shd w:fill="FFFFFF" w:val="clear"/>
+            <w:tcMar>
+              <w:top w:type="dxa" w:w="100"/>
+              <w:left w:type="dxa" w:w="140"/>
+              <w:bottom w:type="dxa" w:w="100"/>
+              <w:right w:type="dxa" w:w="140"/>
+            </w:tcMar>
+            <w:vAlign w:val="top"/>
+          </w:tcPr>
+          <w:p>
+            <w:pPr>
+              <w:jc w:val="left"/>
+            </w:pPr>
+            <w:r>
+              <w:rPr>
+                <w:rFonts w:ascii="Arial" w:cs="Arial" w:eastAsia="Arial" w:hAnsi="Arial"/>
+                <w:b w:val="false"/>
+                <w:bCs w:val="false"/>
+                <w:color w:val="1A1A1A"/>
+                <w:sz w:val="20"/>
+                <w:szCs w:val="20"/>
+              </w:rPr>
+              <w:t xml:space="preserve">Qualitativa</w:t>
+            </w:r>
+          </w:p>
+        </w:tc>
+        <w:tc>
+          <w:tcPr>
+            <w:tcW w:type="dxa" w:w="1000"/>
+            <w:tcBorders>
+              <w:top w:val="single" w:color="C5D5E8" w:sz="4"/>
+              <w:left w:val="single" w:color="C5D5E8" w:sz="4"/>
+              <w:bottom w:val="single" w:color="C5D5E8" w:sz="4"/>
+              <w:right w:val="single" w:color="C5D5E8" w:sz="4"/>
+            </w:tcBorders>
+            <w:shd w:fill="FFFFFF" w:val="clear"/>
+            <w:tcMar>
+              <w:top w:type="dxa" w:w="80"/>
+              <w:left w:type="dxa" w:w="100"/>
+              <w:bottom w:type="dxa" w:w="80"/>
+              <w:right w:type="dxa" w:w="100"/>
+            </w:tcMar>
+          </w:tcPr>
+          <w:p/>
+          <w:p/>
+          <w:p/>
+        </w:tc>
+      </w:tr>
+    </w:tbl>
+    <w:p/>
+    <w:p>
+      <w:pPr>
+        <w:spacing w:after="100" w:before="80"/>
+      </w:pPr>
+      <w:r>
+        <w:rPr>
+          <w:rFonts w:ascii="Arial" w:cs="Arial" w:eastAsia="Arial" w:hAnsi="Arial"/>
+          <w:i/>
+          <w:iCs/>
+          <w:color w:val="555555"/>
+          <w:sz w:val="20"/>
+          <w:szCs w:val="20"/>
+        </w:rPr>
+        <w:t xml:space="preserve">Soglia di validazione: punteggio medio &gt;= 4/5 sulle domande 1-4; almeno 3 su 4 condomini rispondono Si alla domanda 5.</w:t>
+      </w:r>
+    </w:p>
+    <w:p/>
+    <w:p/>
+    <w:p>
+      <w:pPr>
+        <w:pStyle w:val="Heading2"/>
+        <w:spacing w:after="100" w:before="260"/>
+      </w:pPr>
+      <w:r>
+        <w:rPr>
+          <w:rFonts w:ascii="Arial" w:cs="Arial" w:eastAsia="Arial" w:hAnsi="Arial"/>
+          <w:b/>
+          <w:bCs/>
+          <w:color w:val="1B3A6B"/>
+          <w:sz w:val="24"/>
+          <w:szCs w:val="24"/>
+        </w:rPr>
+        <w:t xml:space="preserve">Questionario B - Amministratori</w:t>
+      </w:r>
+    </w:p>
+    <w:p>
+      <w:pPr>
+        <w:spacing w:after="100" w:before="80"/>
+      </w:pPr>
+      <w:r>
+        <w:rPr>
+          <w:rFonts w:ascii="Arial" w:cs="Arial" w:eastAsia="Arial" w:hAnsi="Arial"/>
+          <w:i/>
+          <w:iCs/>
+          <w:color w:val="555555"/>
+          <w:sz w:val="20"/>
+          <w:szCs w:val="20"/>
+        </w:rPr>
+        <w:t xml:space="preserve">Da somministrare ai referenti dei 2 studi coinvolti dopo la sessione con la dashboard. Tempo stimato: 10 minuti.</w:t>
+      </w:r>
+    </w:p>
+    <w:p/>
+    <w:tbl>
+      <w:tblPr>
+        <w:tblW w:type="dxa" w:w="9026"/>
+        <w:tblBorders>
+          <w:top w:val="single" w:color="auto" w:sz="4"/>
+          <w:left w:val="single" w:color="auto" w:sz="4"/>
+          <w:bottom w:val="single" w:color="auto" w:sz="4"/>
+          <w:right w:val="single" w:color="auto" w:sz="4"/>
+          <w:insideH w:val="single" w:color="auto" w:sz="4"/>
+          <w:insideV w:val="single" w:color="auto" w:sz="4"/>
+        </w:tblBorders>
+      </w:tblPr>
+      <w:tblGrid>
+        <w:gridCol w:w="440"/>
+        <w:gridCol w:w="5106"/>
+        <w:gridCol w:w="1000"/>
+        <w:gridCol w:w="1480"/>
+        <w:gridCol w:w="1000"/>
+      </w:tblGrid>
+      <w:tr>
+        <w:trPr>
+          <w:tblHeader/>
+        </w:trPr>
+        <w:tc>
+          <w:tcPr>
+            <w:tcW w:type="dxa" w:w="440"/>
+            <w:tcBorders>
+              <w:top w:val="single" w:color="C5D5E8" w:sz="4"/>
+              <w:left w:val="single" w:color="C5D5E8" w:sz="4"/>
+              <w:bottom w:val="single" w:color="C5D5E8" w:sz="4"/>
+              <w:right w:val="single" w:color="C5D5E8" w:sz="4"/>
+            </w:tcBorders>
+            <w:shd w:fill="1B3A6B" w:val="clear"/>
+            <w:tcMar>
+              <w:top w:type="dxa" w:w="100"/>
+              <w:left w:type="dxa" w:w="140"/>
+              <w:bottom w:type="dxa" w:w="100"/>
+              <w:right w:type="dxa" w:w="140"/>
+            </w:tcMar>
+            <w:vAlign w:val="center"/>
+          </w:tcPr>
+          <w:p>
+            <w:pPr>
+              <w:jc w:val="center"/>
+            </w:pPr>
+            <w:r>
+              <w:rPr>
+                <w:rFonts w:ascii="Arial" w:cs="Arial" w:eastAsia="Arial" w:hAnsi="Arial"/>
+                <w:b/>
+                <w:bCs/>
+                <w:color w:val="FFFFFF"/>
+                <w:sz w:val="20"/>
+                <w:szCs w:val="20"/>
+              </w:rPr>
+              <w:t xml:space="preserve">N.</w:t>
+            </w:r>
+          </w:p>
+        </w:tc>
+        <w:tc>
+          <w:tcPr>
+            <w:tcW w:type="dxa" w:w="5106"/>
+            <w:tcBorders>
+              <w:top w:val="single" w:color="C5D5E8" w:sz="4"/>
+              <w:left w:val="single" w:color="C5D5E8" w:sz="4"/>
+              <w:bottom w:val="single" w:color="C5D5E8" w:sz="4"/>
+              <w:right w:val="single" w:color="C5D5E8" w:sz="4"/>
+            </w:tcBorders>
+            <w:shd w:fill="1B3A6B" w:val="clear"/>
+            <w:tcMar>
+              <w:top w:type="dxa" w:w="100"/>
+              <w:left w:type="dxa" w:w="140"/>
+              <w:bottom w:type="dxa" w:w="100"/>
+              <w:right w:type="dxa" w:w="140"/>
+            </w:tcMar>
+            <w:vAlign w:val="center"/>
+          </w:tcPr>
+          <w:p>
+            <w:pPr>
+              <w:jc w:val="center"/>
+            </w:pPr>
+            <w:r>
+              <w:rPr>
+                <w:rFonts w:ascii="Arial" w:cs="Arial" w:eastAsia="Arial" w:hAnsi="Arial"/>
+                <w:b/>
+                <w:bCs/>
+                <w:color w:val="FFFFFF"/>
+                <w:sz w:val="20"/>
+                <w:szCs w:val="20"/>
+              </w:rPr>
+              <w:t xml:space="preserve">Domanda</w:t>
+            </w:r>
+          </w:p>
+        </w:tc>
+        <w:tc>
+          <w:tcPr>
+            <w:tcW w:type="dxa" w:w="1000"/>
+            <w:tcBorders>
+              <w:top w:val="single" w:color="C5D5E8" w:sz="4"/>
+              <w:left w:val="single" w:color="C5D5E8" w:sz="4"/>
+              <w:bottom w:val="single" w:color="C5D5E8" w:sz="4"/>
+              <w:right w:val="single" w:color="C5D5E8" w:sz="4"/>
+            </w:tcBorders>
+            <w:shd w:fill="1B3A6B" w:val="clear"/>
+            <w:tcMar>
+              <w:top w:type="dxa" w:w="100"/>
+              <w:left w:type="dxa" w:w="140"/>
+              <w:bottom w:type="dxa" w:w="100"/>
+              <w:right w:type="dxa" w:w="140"/>
+            </w:tcMar>
+            <w:vAlign w:val="center"/>
+          </w:tcPr>
+          <w:p>
+            <w:pPr>
+              <w:jc w:val="center"/>
+            </w:pPr>
+            <w:r>
+              <w:rPr>
+                <w:rFonts w:ascii="Arial" w:cs="Arial" w:eastAsia="Arial" w:hAnsi="Arial"/>
+                <w:b/>
+                <w:bCs/>
+                <w:color w:val="FFFFFF"/>
+                <w:sz w:val="20"/>
+                <w:szCs w:val="20"/>
+              </w:rPr>
+              <w:t xml:space="preserve">Scala</w:t>
+            </w:r>
+          </w:p>
+        </w:tc>
+        <w:tc>
+          <w:tcPr>
+            <w:tcW w:type="dxa" w:w="1480"/>
+            <w:tcBorders>
+              <w:top w:val="single" w:color="C5D5E8" w:sz="4"/>
+              <w:left w:val="single" w:color="C5D5E8" w:sz="4"/>
+              <w:bottom w:val="single" w:color="C5D5E8" w:sz="4"/>
+              <w:right w:val="single" w:color="C5D5E8" w:sz="4"/>
+            </w:tcBorders>
+            <w:shd w:fill="1B3A6B" w:val="clear"/>
+            <w:tcMar>
+              <w:top w:type="dxa" w:w="100"/>
+              <w:left w:type="dxa" w:w="140"/>
+              <w:bottom w:type="dxa" w:w="100"/>
+              <w:right w:type="dxa" w:w="140"/>
+            </w:tcMar>
+            <w:vAlign w:val="center"/>
+          </w:tcPr>
+          <w:p>
+            <w:pPr>
+              <w:jc w:val="center"/>
+            </w:pPr>
+            <w:r>
+              <w:rPr>
+                <w:rFonts w:ascii="Arial" w:cs="Arial" w:eastAsia="Arial" w:hAnsi="Arial"/>
+                <w:b/>
+                <w:bCs/>
+                <w:color w:val="FFFFFF"/>
+                <w:sz w:val="20"/>
+                <w:szCs w:val="20"/>
+              </w:rPr>
+              <w:t xml:space="preserve">Metrica TC5</w:t>
+            </w:r>
+          </w:p>
+        </w:tc>
+        <w:tc>
+          <w:tcPr>
+            <w:tcW w:type="dxa" w:w="1000"/>
+            <w:tcBorders>
+              <w:top w:val="single" w:color="C5D5E8" w:sz="4"/>
+              <w:left w:val="single" w:color="C5D5E8" w:sz="4"/>
+              <w:bottom w:val="single" w:color="C5D5E8" w:sz="4"/>
+              <w:right w:val="single" w:color="C5D5E8" w:sz="4"/>
+            </w:tcBorders>
+            <w:shd w:fill="1B3A6B" w:val="clear"/>
+            <w:tcMar>
+              <w:top w:type="dxa" w:w="100"/>
+              <w:left w:type="dxa" w:w="140"/>
+              <w:bottom w:type="dxa" w:w="100"/>
+              <w:right w:type="dxa" w:w="140"/>
+            </w:tcMar>
+            <w:vAlign w:val="center"/>
+          </w:tcPr>
+          <w:p>
+            <w:pPr>
+              <w:jc w:val="center"/>
+            </w:pPr>
+            <w:r>
+              <w:rPr>
+                <w:rFonts w:ascii="Arial" w:cs="Arial" w:eastAsia="Arial" w:hAnsi="Arial"/>
+                <w:b/>
+                <w:bCs/>
+                <w:color w:val="FFFFFF"/>
+                <w:sz w:val="20"/>
+                <w:szCs w:val="20"/>
+              </w:rPr>
+              <w:t xml:space="preserve">Risposta</w:t>
+            </w:r>
+          </w:p>
+        </w:tc>
+      </w:tr>
+      <w:tr>
+        <w:tc>
+          <w:tcPr>
+            <w:tcW w:type="dxa" w:w="440"/>
+            <w:tcBorders>
+              <w:top w:val="single" w:color="C5D5E8" w:sz="4"/>
+              <w:left w:val="single" w:color="C5D5E8" w:sz="4"/>
+              <w:bottom w:val="single" w:color="C5D5E8" w:sz="4"/>
+              <w:right w:val="single" w:color="C5D5E8" w:sz="4"/>
+            </w:tcBorders>
+            <w:shd w:fill="FFFFFF" w:val="clear"/>
+            <w:tcMar>
+              <w:top w:type="dxa" w:w="100"/>
+              <w:left w:type="dxa" w:w="140"/>
+              <w:bottom w:type="dxa" w:w="100"/>
+              <w:right w:type="dxa" w:w="140"/>
+            </w:tcMar>
+            <w:vAlign w:val="top"/>
+          </w:tcPr>
+          <w:p>
+            <w:pPr>
+              <w:jc w:val="center"/>
+            </w:pPr>
+            <w:r>
+              <w:rPr>
+                <w:rFonts w:ascii="Arial" w:cs="Arial" w:eastAsia="Arial" w:hAnsi="Arial"/>
+                <w:b/>
+                <w:bCs/>
+                <w:color w:val="1A1A1A"/>
+                <w:sz w:val="20"/>
+                <w:szCs w:val="20"/>
+              </w:rPr>
+              <w:t xml:space="preserve">1</w:t>
+            </w:r>
+          </w:p>
+        </w:tc>
+        <w:tc>
+          <w:tcPr>
+            <w:tcW w:type="dxa" w:w="5106"/>
+            <w:tcBorders>
+              <w:top w:val="single" w:color="C5D5E8" w:sz="4"/>
+              <w:left w:val="single" w:color="C5D5E8" w:sz="4"/>
+              <w:bottom w:val="single" w:color="C5D5E8" w:sz="4"/>
+              <w:right w:val="single" w:color="C5D5E8" w:sz="4"/>
+            </w:tcBorders>
+            <w:shd w:fill="FFFFFF" w:val="clear"/>
+            <w:tcMar>
+              <w:top w:type="dxa" w:w="100"/>
+              <w:left w:type="dxa" w:w="140"/>
+              <w:bottom w:type="dxa" w:w="100"/>
+              <w:right w:type="dxa" w:w="140"/>
+            </w:tcMar>
+            <w:vAlign w:val="top"/>
+          </w:tcPr>
+          <w:p>
+            <w:pPr>
+              <w:jc w:val="left"/>
+            </w:pPr>
+            <w:r>
+              <w:rPr>
+                <w:rFonts w:ascii="Arial" w:cs="Arial" w:eastAsia="Arial" w:hAnsi="Arial"/>
+                <w:b w:val="false"/>
+                <w:bCs w:val="false"/>
+                <w:color w:val="1A1A1A"/>
+                <w:sz w:val="20"/>
+                <w:szCs w:val="20"/>
+              </w:rPr>
+              <w:t xml:space="preserve">Caricare i documenti nella piattaforma e' stato semplice e intuitivo?</w:t>
+            </w:r>
+          </w:p>
+        </w:tc>
+        <w:tc>
+          <w:tcPr>
+            <w:tcW w:type="dxa" w:w="1000"/>
+            <w:tcBorders>
+              <w:top w:val="single" w:color="C5D5E8" w:sz="4"/>
+              <w:left w:val="single" w:color="C5D5E8" w:sz="4"/>
+              <w:bottom w:val="single" w:color="C5D5E8" w:sz="4"/>
+              <w:right w:val="single" w:color="C5D5E8" w:sz="4"/>
+            </w:tcBorders>
+            <w:shd w:fill="FFFFFF" w:val="clear"/>
+            <w:tcMar>
+              <w:top w:type="dxa" w:w="100"/>
+              <w:left w:type="dxa" w:w="140"/>
+              <w:bottom w:type="dxa" w:w="100"/>
+              <w:right w:type="dxa" w:w="140"/>
+            </w:tcMar>
+            <w:vAlign w:val="top"/>
+          </w:tcPr>
+          <w:p>
+            <w:pPr>
+              <w:jc w:val="center"/>
+            </w:pPr>
+            <w:r>
+              <w:rPr>
+                <w:rFonts w:ascii="Arial" w:cs="Arial" w:eastAsia="Arial" w:hAnsi="Arial"/>
+                <w:b w:val="false"/>
+                <w:bCs w:val="false"/>
+                <w:color w:val="1A1A1A"/>
+                <w:sz w:val="20"/>
+                <w:szCs w:val="20"/>
+              </w:rPr>
+              <w:t xml:space="preserve">1-5</w:t>
+            </w:r>
+          </w:p>
+        </w:tc>
+        <w:tc>
+          <w:tcPr>
+            <w:tcW w:type="dxa" w:w="1480"/>
+            <w:tcBorders>
+              <w:top w:val="single" w:color="C5D5E8" w:sz="4"/>
+              <w:left w:val="single" w:color="C5D5E8" w:sz="4"/>
+              <w:bottom w:val="single" w:color="C5D5E8" w:sz="4"/>
+              <w:right w:val="single" w:color="C5D5E8" w:sz="4"/>
+            </w:tcBorders>
+            <w:shd w:fill="FFFFFF" w:val="clear"/>
+            <w:tcMar>
+              <w:top w:type="dxa" w:w="100"/>
+              <w:left w:type="dxa" w:w="140"/>
+              <w:bottom w:type="dxa" w:w="100"/>
+              <w:right w:type="dxa" w:w="140"/>
+            </w:tcMar>
+            <w:vAlign w:val="top"/>
+          </w:tcPr>
+          <w:p>
+            <w:pPr>
+              <w:jc w:val="left"/>
+            </w:pPr>
+            <w:r>
+              <w:rPr>
+                <w:rFonts w:ascii="Arial" w:cs="Arial" w:eastAsia="Arial" w:hAnsi="Arial"/>
+                <w:b w:val="false"/>
+                <w:bCs w:val="false"/>
+                <w:color w:val="1A1A1A"/>
+                <w:sz w:val="20"/>
+                <w:szCs w:val="20"/>
+              </w:rPr>
+              <w:t xml:space="preserve">Facilita' onboarding</w:t>
+            </w:r>
+          </w:p>
+        </w:tc>
+        <w:tc>
+          <w:tcPr>
+            <w:tcW w:type="dxa" w:w="1000"/>
+            <w:tcBorders>
+              <w:top w:val="single" w:color="C5D5E8" w:sz="4"/>
+              <w:left w:val="single" w:color="C5D5E8" w:sz="4"/>
+              <w:bottom w:val="single" w:color="C5D5E8" w:sz="4"/>
+              <w:right w:val="single" w:color="C5D5E8" w:sz="4"/>
+            </w:tcBorders>
+            <w:shd w:fill="FFFFFF" w:val="clear"/>
+            <w:tcMar>
+              <w:top w:type="dxa" w:w="100"/>
+              <w:left w:type="dxa" w:w="140"/>
+              <w:bottom w:type="dxa" w:w="100"/>
+              <w:right w:type="dxa" w:w="140"/>
+            </w:tcMar>
+            <w:vAlign w:val="top"/>
+          </w:tcPr>
+          <w:p>
+            <w:pPr>
+              <w:jc w:val="left"/>
+            </w:pPr>
+            <w:r>
+              <w:rPr>
+                <w:rFonts w:ascii="Arial" w:cs="Arial" w:eastAsia="Arial" w:hAnsi="Arial"/>
+                <w:b w:val="false"/>
+                <w:bCs w:val="false"/>
+                <w:color w:val="1A1A1A"/>
+                <w:sz w:val="20"/>
+                <w:szCs w:val="20"/>
+              </w:rPr>
+              <w:t xml:space="preserve"/>
+            </w:r>
+          </w:p>
+        </w:tc>
+      </w:tr>
+      <w:tr>
+        <w:tc>
+          <w:tcPr>
+            <w:tcW w:type="dxa" w:w="440"/>
+            <w:tcBorders>
+              <w:top w:val="single" w:color="C5D5E8" w:sz="4"/>
+              <w:left w:val="single" w:color="C5D5E8" w:sz="4"/>
+              <w:bottom w:val="single" w:color="C5D5E8" w:sz="4"/>
+              <w:right w:val="single" w:color="C5D5E8" w:sz="4"/>
+            </w:tcBorders>
+            <w:shd w:fill="F5F5F5" w:val="clear"/>
+            <w:tcMar>
+              <w:top w:type="dxa" w:w="100"/>
+              <w:left w:type="dxa" w:w="140"/>
+              <w:bottom w:type="dxa" w:w="100"/>
+              <w:right w:type="dxa" w:w="140"/>
+            </w:tcMar>
+            <w:vAlign w:val="top"/>
+          </w:tcPr>
+          <w:p>
+            <w:pPr>
+              <w:jc w:val="center"/>
+            </w:pPr>
+            <w:r>
+              <w:rPr>
+                <w:rFonts w:ascii="Arial" w:cs="Arial" w:eastAsia="Arial" w:hAnsi="Arial"/>
+                <w:b/>
+                <w:bCs/>
+                <w:color w:val="1A1A1A"/>
+                <w:sz w:val="20"/>
+                <w:szCs w:val="20"/>
+              </w:rPr>
+              <w:t xml:space="preserve">2</w:t>
+            </w:r>
+          </w:p>
+        </w:tc>
+        <w:tc>
+          <w:tcPr>
+            <w:tcW w:type="dxa" w:w="5106"/>
+            <w:tcBorders>
+              <w:top w:val="single" w:color="C5D5E8" w:sz="4"/>
+              <w:left w:val="single" w:color="C5D5E8" w:sz="4"/>
+              <w:bottom w:val="single" w:color="C5D5E8" w:sz="4"/>
+              <w:right w:val="single" w:color="C5D5E8" w:sz="4"/>
+            </w:tcBorders>
+            <w:shd w:fill="F5F5F5" w:val="clear"/>
+            <w:tcMar>
+              <w:top w:type="dxa" w:w="100"/>
+              <w:left w:type="dxa" w:w="140"/>
+              <w:bottom w:type="dxa" w:w="100"/>
+              <w:right w:type="dxa" w:w="140"/>
+            </w:tcMar>
+            <w:vAlign w:val="top"/>
+          </w:tcPr>
+          <w:p>
+            <w:pPr>
+              <w:jc w:val="left"/>
+            </w:pPr>
+            <w:r>
+              <w:rPr>
+                <w:rFonts w:ascii="Arial" w:cs="Arial" w:eastAsia="Arial" w:hAnsi="Arial"/>
+                <w:b w:val="false"/>
+                <w:bCs w:val="false"/>
+                <w:color w:val="1A1A1A"/>
+                <w:sz w:val="20"/>
+                <w:szCs w:val="20"/>
+              </w:rPr>
+              <w:t xml:space="preserve">La dashboard ti ha dato una visione chiara delle richieste arrivate?</w:t>
+            </w:r>
+          </w:p>
+        </w:tc>
+        <w:tc>
+          <w:tcPr>
+            <w:tcW w:type="dxa" w:w="1000"/>
+            <w:tcBorders>
+              <w:top w:val="single" w:color="C5D5E8" w:sz="4"/>
+              <w:left w:val="single" w:color="C5D5E8" w:sz="4"/>
+              <w:bottom w:val="single" w:color="C5D5E8" w:sz="4"/>
+              <w:right w:val="single" w:color="C5D5E8" w:sz="4"/>
+            </w:tcBorders>
+            <w:shd w:fill="F5F5F5" w:val="clear"/>
+            <w:tcMar>
+              <w:top w:type="dxa" w:w="100"/>
+              <w:left w:type="dxa" w:w="140"/>
+              <w:bottom w:type="dxa" w:w="100"/>
+              <w:right w:type="dxa" w:w="140"/>
+            </w:tcMar>
+            <w:vAlign w:val="top"/>
+          </w:tcPr>
+          <w:p>
+            <w:pPr>
+              <w:jc w:val="center"/>
+            </w:pPr>
+            <w:r>
+              <w:rPr>
+                <w:rFonts w:ascii="Arial" w:cs="Arial" w:eastAsia="Arial" w:hAnsi="Arial"/>
+                <w:b w:val="false"/>
+                <w:bCs w:val="false"/>
+                <w:color w:val="1A1A1A"/>
+                <w:sz w:val="20"/>
+                <w:szCs w:val="20"/>
+              </w:rPr>
+              <w:t xml:space="preserve">1-5</w:t>
+            </w:r>
+          </w:p>
+        </w:tc>
+        <w:tc>
+          <w:tcPr>
+            <w:tcW w:type="dxa" w:w="1480"/>
+            <w:tcBorders>
+              <w:top w:val="single" w:color="C5D5E8" w:sz="4"/>
+              <w:left w:val="single" w:color="C5D5E8" w:sz="4"/>
+              <w:bottom w:val="single" w:color="C5D5E8" w:sz="4"/>
+              <w:right w:val="single" w:color="C5D5E8" w:sz="4"/>
+            </w:tcBorders>
+            <w:shd w:fill="F5F5F5" w:val="clear"/>
+            <w:tcMar>
+              <w:top w:type="dxa" w:w="100"/>
+              <w:left w:type="dxa" w:w="140"/>
+              <w:bottom w:type="dxa" w:w="100"/>
+              <w:right w:type="dxa" w:w="140"/>
+            </w:tcMar>
+            <w:vAlign w:val="top"/>
+          </w:tcPr>
+          <w:p>
+            <w:pPr>
+              <w:jc w:val="left"/>
+            </w:pPr>
+            <w:r>
+              <w:rPr>
+                <w:rFonts w:ascii="Arial" w:cs="Arial" w:eastAsia="Arial" w:hAnsi="Arial"/>
+                <w:b w:val="false"/>
+                <w:bCs w:val="false"/>
+                <w:color w:val="1A1A1A"/>
+                <w:sz w:val="20"/>
+                <w:szCs w:val="20"/>
+              </w:rPr>
+              <w:t xml:space="preserve">Utilita' dashboard</w:t>
+            </w:r>
+          </w:p>
+        </w:tc>
+        <w:tc>
+          <w:tcPr>
+            <w:tcW w:type="dxa" w:w="1000"/>
+            <w:tcBorders>
+              <w:top w:val="single" w:color="C5D5E8" w:sz="4"/>
+              <w:left w:val="single" w:color="C5D5E8" w:sz="4"/>
+              <w:bottom w:val="single" w:color="C5D5E8" w:sz="4"/>
+              <w:right w:val="single" w:color="C5D5E8" w:sz="4"/>
+            </w:tcBorders>
+            <w:shd w:fill="F5F5F5" w:val="clear"/>
+            <w:tcMar>
+              <w:top w:type="dxa" w:w="100"/>
+              <w:left w:type="dxa" w:w="140"/>
+              <w:bottom w:type="dxa" w:w="100"/>
+              <w:right w:type="dxa" w:w="140"/>
+            </w:tcMar>
+            <w:vAlign w:val="top"/>
+          </w:tcPr>
+          <w:p>
+            <w:pPr>
+              <w:jc w:val="left"/>
+            </w:pPr>
+            <w:r>
+              <w:rPr>
+                <w:rFonts w:ascii="Arial" w:cs="Arial" w:eastAsia="Arial" w:hAnsi="Arial"/>
+                <w:b w:val="false"/>
+                <w:bCs w:val="false"/>
+                <w:color w:val="1A1A1A"/>
+                <w:sz w:val="20"/>
+                <w:szCs w:val="20"/>
+              </w:rPr>
+              <w:t xml:space="preserve"/>
+            </w:r>
+          </w:p>
+        </w:tc>
+      </w:tr>
+      <w:tr>
+        <w:tc>
+          <w:tcPr>
+            <w:tcW w:type="dxa" w:w="440"/>
+            <w:tcBorders>
+              <w:top w:val="single" w:color="C5D5E8" w:sz="4"/>
+              <w:left w:val="single" w:color="C5D5E8" w:sz="4"/>
+              <w:bottom w:val="single" w:color="C5D5E8" w:sz="4"/>
+              <w:right w:val="single" w:color="C5D5E8" w:sz="4"/>
+            </w:tcBorders>
+            <w:shd w:fill="FFFFFF" w:val="clear"/>
+            <w:tcMar>
+              <w:top w:type="dxa" w:w="100"/>
+              <w:left w:type="dxa" w:w="140"/>
+              <w:bottom w:type="dxa" w:w="100"/>
+              <w:right w:type="dxa" w:w="140"/>
+            </w:tcMar>
+            <w:vAlign w:val="top"/>
+          </w:tcPr>
+          <w:p>
+            <w:pPr>
+              <w:jc w:val="center"/>
+            </w:pPr>
+            <w:r>
+              <w:rPr>
+                <w:rFonts w:ascii="Arial" w:cs="Arial" w:eastAsia="Arial" w:hAnsi="Arial"/>
+                <w:b/>
+                <w:bCs/>
+                <w:color w:val="1A1A1A"/>
+                <w:sz w:val="20"/>
+                <w:szCs w:val="20"/>
+              </w:rPr>
+              <w:t xml:space="preserve">3</w:t>
+            </w:r>
+          </w:p>
+        </w:tc>
+        <w:tc>
+          <w:tcPr>
+            <w:tcW w:type="dxa" w:w="5106"/>
+            <w:tcBorders>
+              <w:top w:val="single" w:color="C5D5E8" w:sz="4"/>
+              <w:left w:val="single" w:color="C5D5E8" w:sz="4"/>
+              <w:bottom w:val="single" w:color="C5D5E8" w:sz="4"/>
+              <w:right w:val="single" w:color="C5D5E8" w:sz="4"/>
+            </w:tcBorders>
+            <w:shd w:fill="FFFFFF" w:val="clear"/>
+            <w:tcMar>
+              <w:top w:type="dxa" w:w="100"/>
+              <w:left w:type="dxa" w:w="140"/>
+              <w:bottom w:type="dxa" w:w="100"/>
+              <w:right w:type="dxa" w:w="140"/>
+            </w:tcMar>
+            <w:vAlign w:val="top"/>
+          </w:tcPr>
+          <w:p>
+            <w:pPr>
+              <w:jc w:val="left"/>
+            </w:pPr>
+            <w:r>
+              <w:rPr>
+                <w:rFonts w:ascii="Arial" w:cs="Arial" w:eastAsia="Arial" w:hAnsi="Arial"/>
+                <w:b w:val="false"/>
+                <w:bCs w:val="false"/>
+                <w:color w:val="1A1A1A"/>
+                <w:sz w:val="20"/>
+                <w:szCs w:val="20"/>
+              </w:rPr>
+              <w:t xml:space="preserve">La classificazione automatica per categoria (documentale, segnalazione, ecc.) ti ha aiutato a capire subito cosa stava succedendo?</w:t>
+            </w:r>
+          </w:p>
+        </w:tc>
+        <w:tc>
+          <w:tcPr>
+            <w:tcW w:type="dxa" w:w="1000"/>
+            <w:tcBorders>
+              <w:top w:val="single" w:color="C5D5E8" w:sz="4"/>
+              <w:left w:val="single" w:color="C5D5E8" w:sz="4"/>
+              <w:bottom w:val="single" w:color="C5D5E8" w:sz="4"/>
+              <w:right w:val="single" w:color="C5D5E8" w:sz="4"/>
+            </w:tcBorders>
+            <w:shd w:fill="FFFFFF" w:val="clear"/>
+            <w:tcMar>
+              <w:top w:type="dxa" w:w="100"/>
+              <w:left w:type="dxa" w:w="140"/>
+              <w:bottom w:type="dxa" w:w="100"/>
+              <w:right w:type="dxa" w:w="140"/>
+            </w:tcMar>
+            <w:vAlign w:val="top"/>
+          </w:tcPr>
+          <w:p>
+            <w:pPr>
+              <w:jc w:val="center"/>
+            </w:pPr>
+            <w:r>
+              <w:rPr>
+                <w:rFonts w:ascii="Arial" w:cs="Arial" w:eastAsia="Arial" w:hAnsi="Arial"/>
+                <w:b w:val="false"/>
+                <w:bCs w:val="false"/>
+                <w:color w:val="1A1A1A"/>
+                <w:sz w:val="20"/>
+                <w:szCs w:val="20"/>
+              </w:rPr>
+              <w:t xml:space="preserve">1-5</w:t>
+            </w:r>
+          </w:p>
+        </w:tc>
+        <w:tc>
+          <w:tcPr>
+            <w:tcW w:type="dxa" w:w="1480"/>
+            <w:tcBorders>
+              <w:top w:val="single" w:color="C5D5E8" w:sz="4"/>
+              <w:left w:val="single" w:color="C5D5E8" w:sz="4"/>
+              <w:bottom w:val="single" w:color="C5D5E8" w:sz="4"/>
+              <w:right w:val="single" w:color="C5D5E8" w:sz="4"/>
+            </w:tcBorders>
+            <w:shd w:fill="FFFFFF" w:val="clear"/>
+            <w:tcMar>
+              <w:top w:type="dxa" w:w="100"/>
+              <w:left w:type="dxa" w:w="140"/>
+              <w:bottom w:type="dxa" w:w="100"/>
+              <w:right w:type="dxa" w:w="140"/>
+            </w:tcMar>
+            <w:vAlign w:val="top"/>
+          </w:tcPr>
+          <w:p>
+            <w:pPr>
+              <w:jc w:val="left"/>
+            </w:pPr>
+            <w:r>
+              <w:rPr>
+                <w:rFonts w:ascii="Arial" w:cs="Arial" w:eastAsia="Arial" w:hAnsi="Arial"/>
+                <w:b w:val="false"/>
+                <w:bCs w:val="false"/>
+                <w:color w:val="1A1A1A"/>
+                <w:sz w:val="20"/>
+                <w:szCs w:val="20"/>
+              </w:rPr>
+              <w:t xml:space="preserve">Utilita' clusterizzazione</w:t>
+            </w:r>
+          </w:p>
+        </w:tc>
+        <w:tc>
+          <w:tcPr>
+            <w:tcW w:type="dxa" w:w="1000"/>
+            <w:tcBorders>
+              <w:top w:val="single" w:color="C5D5E8" w:sz="4"/>
+              <w:left w:val="single" w:color="C5D5E8" w:sz="4"/>
+              <w:bottom w:val="single" w:color="C5D5E8" w:sz="4"/>
+              <w:right w:val="single" w:color="C5D5E8" w:sz="4"/>
+            </w:tcBorders>
+            <w:shd w:fill="FFFFFF" w:val="clear"/>
+            <w:tcMar>
+              <w:top w:type="dxa" w:w="100"/>
+              <w:left w:type="dxa" w:w="140"/>
+              <w:bottom w:type="dxa" w:w="100"/>
+              <w:right w:type="dxa" w:w="140"/>
+            </w:tcMar>
+            <w:vAlign w:val="top"/>
+          </w:tcPr>
+          <w:p>
+            <w:pPr>
+              <w:jc w:val="left"/>
+            </w:pPr>
+            <w:r>
+              <w:rPr>
+                <w:rFonts w:ascii="Arial" w:cs="Arial" w:eastAsia="Arial" w:hAnsi="Arial"/>
+                <w:b w:val="false"/>
+                <w:bCs w:val="false"/>
+                <w:color w:val="1A1A1A"/>
+                <w:sz w:val="20"/>
+                <w:szCs w:val="20"/>
+              </w:rPr>
+              <w:t xml:space="preserve"/>
+            </w:r>
+          </w:p>
+        </w:tc>
+      </w:tr>
+      <w:tr>
+        <w:tc>
+          <w:tcPr>
+            <w:tcW w:type="dxa" w:w="440"/>
+            <w:tcBorders>
+              <w:top w:val="single" w:color="C5D5E8" w:sz="4"/>
+              <w:left w:val="single" w:color="C5D5E8" w:sz="4"/>
+              <w:bottom w:val="single" w:color="C5D5E8" w:sz="4"/>
+              <w:right w:val="single" w:color="C5D5E8" w:sz="4"/>
+            </w:tcBorders>
+            <w:shd w:fill="F5F5F5" w:val="clear"/>
+            <w:tcMar>
+              <w:top w:type="dxa" w:w="100"/>
+              <w:left w:type="dxa" w:w="140"/>
+              <w:bottom w:type="dxa" w:w="100"/>
+              <w:right w:type="dxa" w:w="140"/>
+            </w:tcMar>
+            <w:vAlign w:val="top"/>
+          </w:tcPr>
+          <w:p>
+            <w:pPr>
+              <w:jc w:val="center"/>
+            </w:pPr>
+            <w:r>
+              <w:rPr>
+                <w:rFonts w:ascii="Arial" w:cs="Arial" w:eastAsia="Arial" w:hAnsi="Arial"/>
+                <w:b/>
+                <w:bCs/>
+                <w:color w:val="1A1A1A"/>
+                <w:sz w:val="20"/>
+                <w:szCs w:val="20"/>
+              </w:rPr>
+              <w:t xml:space="preserve">4</w:t>
+            </w:r>
+          </w:p>
+        </w:tc>
+        <w:tc>
+          <w:tcPr>
+            <w:tcW w:type="dxa" w:w="5106"/>
+            <w:tcBorders>
+              <w:top w:val="single" w:color="C5D5E8" w:sz="4"/>
+              <w:left w:val="single" w:color="C5D5E8" w:sz="4"/>
+              <w:bottom w:val="single" w:color="C5D5E8" w:sz="4"/>
+              <w:right w:val="single" w:color="C5D5E8" w:sz="4"/>
+            </w:tcBorders>
+            <w:shd w:fill="F5F5F5" w:val="clear"/>
+            <w:tcMar>
+              <w:top w:type="dxa" w:w="100"/>
+              <w:left w:type="dxa" w:w="140"/>
+              <w:bottom w:type="dxa" w:w="100"/>
+              <w:right w:type="dxa" w:w="140"/>
+            </w:tcMar>
+            <w:vAlign w:val="top"/>
+          </w:tcPr>
+          <w:p>
+            <w:pPr>
+              <w:jc w:val="left"/>
+            </w:pPr>
+            <w:r>
+              <w:rPr>
+                <w:rFonts w:ascii="Arial" w:cs="Arial" w:eastAsia="Arial" w:hAnsi="Arial"/>
+                <w:b w:val="false"/>
+                <w:bCs w:val="false"/>
+                <w:color w:val="1A1A1A"/>
+                <w:sz w:val="20"/>
+                <w:szCs w:val="20"/>
+              </w:rPr>
+              <w:t xml:space="preserve">La priorita' assegnata automaticamente (urgente, alta, normale, bassa) ti e' sembrata corretta?</w:t>
+            </w:r>
+          </w:p>
+        </w:tc>
+        <w:tc>
+          <w:tcPr>
+            <w:tcW w:type="dxa" w:w="1000"/>
+            <w:tcBorders>
+              <w:top w:val="single" w:color="C5D5E8" w:sz="4"/>
+              <w:left w:val="single" w:color="C5D5E8" w:sz="4"/>
+              <w:bottom w:val="single" w:color="C5D5E8" w:sz="4"/>
+              <w:right w:val="single" w:color="C5D5E8" w:sz="4"/>
+            </w:tcBorders>
+            <w:shd w:fill="F5F5F5" w:val="clear"/>
+            <w:tcMar>
+              <w:top w:type="dxa" w:w="100"/>
+              <w:left w:type="dxa" w:w="140"/>
+              <w:bottom w:type="dxa" w:w="100"/>
+              <w:right w:type="dxa" w:w="140"/>
+            </w:tcMar>
+            <w:vAlign w:val="top"/>
+          </w:tcPr>
+          <w:p>
+            <w:pPr>
+              <w:jc w:val="center"/>
+            </w:pPr>
+            <w:r>
+              <w:rPr>
+                <w:rFonts w:ascii="Arial" w:cs="Arial" w:eastAsia="Arial" w:hAnsi="Arial"/>
+                <w:b w:val="false"/>
+                <w:bCs w:val="false"/>
+                <w:color w:val="1A1A1A"/>
+                <w:sz w:val="20"/>
+                <w:szCs w:val="20"/>
+              </w:rPr>
+              <w:t xml:space="preserve">1-5</w:t>
+            </w:r>
+          </w:p>
+        </w:tc>
+        <w:tc>
+          <w:tcPr>
+            <w:tcW w:type="dxa" w:w="1480"/>
+            <w:tcBorders>
+              <w:top w:val="single" w:color="C5D5E8" w:sz="4"/>
+              <w:left w:val="single" w:color="C5D5E8" w:sz="4"/>
+              <w:bottom w:val="single" w:color="C5D5E8" w:sz="4"/>
+              <w:right w:val="single" w:color="C5D5E8" w:sz="4"/>
+            </w:tcBorders>
+            <w:shd w:fill="F5F5F5" w:val="clear"/>
+            <w:tcMar>
+              <w:top w:type="dxa" w:w="100"/>
+              <w:left w:type="dxa" w:w="140"/>
+              <w:bottom w:type="dxa" w:w="100"/>
+              <w:right w:type="dxa" w:w="140"/>
+            </w:tcMar>
+            <w:vAlign w:val="top"/>
+          </w:tcPr>
+          <w:p>
+            <w:pPr>
+              <w:jc w:val="left"/>
+            </w:pPr>
+            <w:r>
+              <w:rPr>
+                <w:rFonts w:ascii="Arial" w:cs="Arial" w:eastAsia="Arial" w:hAnsi="Arial"/>
+                <w:b w:val="false"/>
+                <w:bCs w:val="false"/>
+                <w:color w:val="1A1A1A"/>
+                <w:sz w:val="20"/>
+                <w:szCs w:val="20"/>
+              </w:rPr>
+              <w:t xml:space="preserve">Accuratezza triage</w:t>
+            </w:r>
+          </w:p>
+        </w:tc>
+        <w:tc>
+          <w:tcPr>
+            <w:tcW w:type="dxa" w:w="1000"/>
+            <w:tcBorders>
+              <w:top w:val="single" w:color="C5D5E8" w:sz="4"/>
+              <w:left w:val="single" w:color="C5D5E8" w:sz="4"/>
+              <w:bottom w:val="single" w:color="C5D5E8" w:sz="4"/>
+              <w:right w:val="single" w:color="C5D5E8" w:sz="4"/>
+            </w:tcBorders>
+            <w:shd w:fill="F5F5F5" w:val="clear"/>
+            <w:tcMar>
+              <w:top w:type="dxa" w:w="100"/>
+              <w:left w:type="dxa" w:w="140"/>
+              <w:bottom w:type="dxa" w:w="100"/>
+              <w:right w:type="dxa" w:w="140"/>
+            </w:tcMar>
+            <w:vAlign w:val="top"/>
+          </w:tcPr>
+          <w:p>
+            <w:pPr>
+              <w:jc w:val="left"/>
+            </w:pPr>
+            <w:r>
+              <w:rPr>
+                <w:rFonts w:ascii="Arial" w:cs="Arial" w:eastAsia="Arial" w:hAnsi="Arial"/>
+                <w:b w:val="false"/>
+                <w:bCs w:val="false"/>
+                <w:color w:val="1A1A1A"/>
+                <w:sz w:val="20"/>
+                <w:szCs w:val="20"/>
+              </w:rPr>
+              <w:t xml:space="preserve"/>
+            </w:r>
+          </w:p>
+        </w:tc>
+      </w:tr>
+      <w:tr>
+        <w:tc>
+          <w:tcPr>
+            <w:tcW w:type="dxa" w:w="440"/>
+            <w:tcBorders>
+              <w:top w:val="single" w:color="C5D5E8" w:sz="4"/>
+              <w:left w:val="single" w:color="C5D5E8" w:sz="4"/>
+              <w:bottom w:val="single" w:color="C5D5E8" w:sz="4"/>
+              <w:right w:val="single" w:color="C5D5E8" w:sz="4"/>
+            </w:tcBorders>
+            <w:shd w:fill="FFFFFF" w:val="clear"/>
+            <w:tcMar>
+              <w:top w:type="dxa" w:w="100"/>
+              <w:left w:type="dxa" w:w="140"/>
+              <w:bottom w:type="dxa" w:w="100"/>
+              <w:right w:type="dxa" w:w="140"/>
+            </w:tcMar>
+            <w:vAlign w:val="top"/>
+          </w:tcPr>
+          <w:p>
+            <w:pPr>
+              <w:jc w:val="center"/>
+            </w:pPr>
+            <w:r>
+              <w:rPr>
+                <w:rFonts w:ascii="Arial" w:cs="Arial" w:eastAsia="Arial" w:hAnsi="Arial"/>
+                <w:b/>
+                <w:bCs/>
+                <w:color w:val="1A1A1A"/>
+                <w:sz w:val="20"/>
+                <w:szCs w:val="20"/>
+              </w:rPr>
+              <w:t xml:space="preserve">5</w:t>
+            </w:r>
+          </w:p>
+        </w:tc>
+        <w:tc>
+          <w:tcPr>
+            <w:tcW w:type="dxa" w:w="5106"/>
+            <w:tcBorders>
+              <w:top w:val="single" w:color="C5D5E8" w:sz="4"/>
+              <w:left w:val="single" w:color="C5D5E8" w:sz="4"/>
+              <w:bottom w:val="single" w:color="C5D5E8" w:sz="4"/>
+              <w:right w:val="single" w:color="C5D5E8" w:sz="4"/>
+            </w:tcBorders>
+            <w:shd w:fill="FFFFFF" w:val="clear"/>
+            <w:tcMar>
+              <w:top w:type="dxa" w:w="100"/>
+              <w:left w:type="dxa" w:w="140"/>
+              <w:bottom w:type="dxa" w:w="100"/>
+              <w:right w:type="dxa" w:w="140"/>
+            </w:tcMar>
+            <w:vAlign w:val="top"/>
+          </w:tcPr>
+          <w:p>
+            <w:pPr>
+              <w:jc w:val="left"/>
+            </w:pPr>
+            <w:r>
+              <w:rPr>
+                <w:rFonts w:ascii="Arial" w:cs="Arial" w:eastAsia="Arial" w:hAnsi="Arial"/>
+                <w:b w:val="false"/>
+                <w:bCs w:val="false"/>
+                <w:color w:val="1A1A1A"/>
+                <w:sz w:val="20"/>
+                <w:szCs w:val="20"/>
+              </w:rPr>
+              <w:t xml:space="preserve">Le risposte gestite automaticamente dall'AI erano appropriate? Avresti risposto diversamente?</w:t>
+            </w:r>
+          </w:p>
+        </w:tc>
+        <w:tc>
+          <w:tcPr>
+            <w:tcW w:type="dxa" w:w="1000"/>
+            <w:tcBorders>
+              <w:top w:val="single" w:color="C5D5E8" w:sz="4"/>
+              <w:left w:val="single" w:color="C5D5E8" w:sz="4"/>
+              <w:bottom w:val="single" w:color="C5D5E8" w:sz="4"/>
+              <w:right w:val="single" w:color="C5D5E8" w:sz="4"/>
+            </w:tcBorders>
+            <w:shd w:fill="FFFFFF" w:val="clear"/>
+            <w:tcMar>
+              <w:top w:type="dxa" w:w="100"/>
+              <w:left w:type="dxa" w:w="140"/>
+              <w:bottom w:type="dxa" w:w="100"/>
+              <w:right w:type="dxa" w:w="140"/>
+            </w:tcMar>
+            <w:vAlign w:val="top"/>
+          </w:tcPr>
+          <w:p>
+            <w:pPr>
+              <w:jc w:val="center"/>
+            </w:pPr>
+            <w:r>
+              <w:rPr>
+                <w:rFonts w:ascii="Arial" w:cs="Arial" w:eastAsia="Arial" w:hAnsi="Arial"/>
+                <w:b w:val="false"/>
+                <w:bCs w:val="false"/>
+                <w:color w:val="1A1A1A"/>
+                <w:sz w:val="20"/>
+                <w:szCs w:val="20"/>
+              </w:rPr>
+              <w:t xml:space="preserve">1-5 + note</w:t>
+            </w:r>
+          </w:p>
+        </w:tc>
+        <w:tc>
+          <w:tcPr>
+            <w:tcW w:type="dxa" w:w="1480"/>
+            <w:tcBorders>
+              <w:top w:val="single" w:color="C5D5E8" w:sz="4"/>
+              <w:left w:val="single" w:color="C5D5E8" w:sz="4"/>
+              <w:bottom w:val="single" w:color="C5D5E8" w:sz="4"/>
+              <w:right w:val="single" w:color="C5D5E8" w:sz="4"/>
+            </w:tcBorders>
+            <w:shd w:fill="FFFFFF" w:val="clear"/>
+            <w:tcMar>
+              <w:top w:type="dxa" w:w="100"/>
+              <w:left w:type="dxa" w:w="140"/>
+              <w:bottom w:type="dxa" w:w="100"/>
+              <w:right w:type="dxa" w:w="140"/>
+            </w:tcMar>
+            <w:vAlign w:val="top"/>
+          </w:tcPr>
+          <w:p>
+            <w:pPr>
+              <w:jc w:val="left"/>
+            </w:pPr>
+            <w:r>
+              <w:rPr>
+                <w:rFonts w:ascii="Arial" w:cs="Arial" w:eastAsia="Arial" w:hAnsi="Arial"/>
+                <w:b w:val="false"/>
+                <w:bCs w:val="false"/>
+                <w:color w:val="1A1A1A"/>
+                <w:sz w:val="20"/>
+                <w:szCs w:val="20"/>
+              </w:rPr>
+              <w:t xml:space="preserve">Qualita' risposta AI</w:t>
+            </w:r>
+          </w:p>
+        </w:tc>
+        <w:tc>
+          <w:tcPr>
+            <w:tcW w:type="dxa" w:w="1000"/>
+            <w:tcBorders>
+              <w:top w:val="single" w:color="C5D5E8" w:sz="4"/>
+              <w:left w:val="single" w:color="C5D5E8" w:sz="4"/>
+              <w:bottom w:val="single" w:color="C5D5E8" w:sz="4"/>
+              <w:right w:val="single" w:color="C5D5E8" w:sz="4"/>
+            </w:tcBorders>
+            <w:shd w:fill="FFFFFF" w:val="clear"/>
+            <w:tcMar>
+              <w:top w:type="dxa" w:w="80"/>
+              <w:left w:type="dxa" w:w="100"/>
+              <w:bottom w:type="dxa" w:w="80"/>
+              <w:right w:type="dxa" w:w="100"/>
+            </w:tcMar>
+          </w:tcPr>
+          <w:p/>
+          <w:p/>
+          <w:p/>
+        </w:tc>
+      </w:tr>
+      <w:tr>
+        <w:tc>
+          <w:tcPr>
+            <w:tcW w:type="dxa" w:w="440"/>
+            <w:tcBorders>
+              <w:top w:val="single" w:color="C5D5E8" w:sz="4"/>
+              <w:left w:val="single" w:color="C5D5E8" w:sz="4"/>
+              <w:bottom w:val="single" w:color="C5D5E8" w:sz="4"/>
+              <w:right w:val="single" w:color="C5D5E8" w:sz="4"/>
+            </w:tcBorders>
+            <w:shd w:fill="F5F5F5" w:val="clear"/>
+            <w:tcMar>
+              <w:top w:type="dxa" w:w="100"/>
+              <w:left w:type="dxa" w:w="140"/>
+              <w:bottom w:type="dxa" w:w="100"/>
+              <w:right w:type="dxa" w:w="140"/>
+            </w:tcMar>
+            <w:vAlign w:val="top"/>
+          </w:tcPr>
+          <w:p>
+            <w:pPr>
+              <w:jc w:val="center"/>
+            </w:pPr>
+            <w:r>
+              <w:rPr>
+                <w:rFonts w:ascii="Arial" w:cs="Arial" w:eastAsia="Arial" w:hAnsi="Arial"/>
+                <w:b/>
+                <w:bCs/>
+                <w:color w:val="1A1A1A"/>
+                <w:sz w:val="20"/>
+                <w:szCs w:val="20"/>
+              </w:rPr>
+              <w:t xml:space="preserve">6</w:t>
+            </w:r>
+          </w:p>
+        </w:tc>
+        <w:tc>
+          <w:tcPr>
+            <w:tcW w:type="dxa" w:w="5106"/>
+            <w:tcBorders>
+              <w:top w:val="single" w:color="C5D5E8" w:sz="4"/>
+              <w:left w:val="single" w:color="C5D5E8" w:sz="4"/>
+              <w:bottom w:val="single" w:color="C5D5E8" w:sz="4"/>
+              <w:right w:val="single" w:color="C5D5E8" w:sz="4"/>
+            </w:tcBorders>
+            <w:shd w:fill="F5F5F5" w:val="clear"/>
+            <w:tcMar>
+              <w:top w:type="dxa" w:w="100"/>
+              <w:left w:type="dxa" w:w="140"/>
+              <w:bottom w:type="dxa" w:w="100"/>
+              <w:right w:type="dxa" w:w="140"/>
+            </w:tcMar>
+            <w:vAlign w:val="top"/>
+          </w:tcPr>
+          <w:p>
+            <w:pPr>
+              <w:jc w:val="left"/>
+            </w:pPr>
+            <w:r>
+              <w:rPr>
+                <w:rFonts w:ascii="Arial" w:cs="Arial" w:eastAsia="Arial" w:hAnsi="Arial"/>
+                <w:b w:val="false"/>
+                <w:bCs w:val="false"/>
+                <w:color w:val="1A1A1A"/>
+                <w:sz w:val="20"/>
+                <w:szCs w:val="20"/>
+              </w:rPr>
+              <w:t xml:space="preserve">Quanto tempo stimi di aver risparmiato rispetto alla gestione tradizionale (telefono / email)?</w:t>
+            </w:r>
+          </w:p>
+        </w:tc>
+        <w:tc>
+          <w:tcPr>
+            <w:tcW w:type="dxa" w:w="1000"/>
+            <w:tcBorders>
+              <w:top w:val="single" w:color="C5D5E8" w:sz="4"/>
+              <w:left w:val="single" w:color="C5D5E8" w:sz="4"/>
+              <w:bottom w:val="single" w:color="C5D5E8" w:sz="4"/>
+              <w:right w:val="single" w:color="C5D5E8" w:sz="4"/>
+            </w:tcBorders>
+            <w:shd w:fill="F5F5F5" w:val="clear"/>
+            <w:tcMar>
+              <w:top w:type="dxa" w:w="100"/>
+              <w:left w:type="dxa" w:w="140"/>
+              <w:bottom w:type="dxa" w:w="100"/>
+              <w:right w:type="dxa" w:w="140"/>
+            </w:tcMar>
+            <w:vAlign w:val="top"/>
+          </w:tcPr>
+          <w:p>
+            <w:pPr>
+              <w:jc w:val="center"/>
+            </w:pPr>
+            <w:r>
+              <w:rPr>
+                <w:rFonts w:ascii="Arial" w:cs="Arial" w:eastAsia="Arial" w:hAnsi="Arial"/>
+                <w:b w:val="false"/>
+                <w:bCs w:val="false"/>
+                <w:color w:val="1A1A1A"/>
+                <w:sz w:val="20"/>
+                <w:szCs w:val="20"/>
+              </w:rPr>
+              <w:t xml:space="preserve">Min / Ore</w:t>
+            </w:r>
+          </w:p>
+        </w:tc>
+        <w:tc>
+          <w:tcPr>
+            <w:tcW w:type="dxa" w:w="1480"/>
+            <w:tcBorders>
+              <w:top w:val="single" w:color="C5D5E8" w:sz="4"/>
+              <w:left w:val="single" w:color="C5D5E8" w:sz="4"/>
+              <w:bottom w:val="single" w:color="C5D5E8" w:sz="4"/>
+              <w:right w:val="single" w:color="C5D5E8" w:sz="4"/>
+            </w:tcBorders>
+            <w:shd w:fill="F5F5F5" w:val="clear"/>
+            <w:tcMar>
+              <w:top w:type="dxa" w:w="100"/>
+              <w:left w:type="dxa" w:w="140"/>
+              <w:bottom w:type="dxa" w:w="100"/>
+              <w:right w:type="dxa" w:w="140"/>
+            </w:tcMar>
+            <w:vAlign w:val="top"/>
+          </w:tcPr>
+          <w:p>
+            <w:pPr>
+              <w:jc w:val="left"/>
+            </w:pPr>
+            <w:r>
+              <w:rPr>
+                <w:rFonts w:ascii="Arial" w:cs="Arial" w:eastAsia="Arial" w:hAnsi="Arial"/>
+                <w:b w:val="false"/>
+                <w:bCs w:val="false"/>
+                <w:color w:val="1A1A1A"/>
+                <w:sz w:val="20"/>
+                <w:szCs w:val="20"/>
+              </w:rPr>
+              <w:t xml:space="preserve">Risparmio operativo</w:t>
+            </w:r>
+          </w:p>
+        </w:tc>
+        <w:tc>
+          <w:tcPr>
+            <w:tcW w:type="dxa" w:w="1000"/>
+            <w:tcBorders>
+              <w:top w:val="single" w:color="C5D5E8" w:sz="4"/>
+              <w:left w:val="single" w:color="C5D5E8" w:sz="4"/>
+              <w:bottom w:val="single" w:color="C5D5E8" w:sz="4"/>
+              <w:right w:val="single" w:color="C5D5E8" w:sz="4"/>
+            </w:tcBorders>
+            <w:shd w:fill="F5F5F5" w:val="clear"/>
+            <w:tcMar>
+              <w:top w:type="dxa" w:w="100"/>
+              <w:left w:type="dxa" w:w="140"/>
+              <w:bottom w:type="dxa" w:w="100"/>
+              <w:right w:type="dxa" w:w="140"/>
+            </w:tcMar>
+            <w:vAlign w:val="top"/>
+          </w:tcPr>
+          <w:p>
+            <w:pPr>
+              <w:jc w:val="left"/>
+            </w:pPr>
+            <w:r>
+              <w:rPr>
+                <w:rFonts w:ascii="Arial" w:cs="Arial" w:eastAsia="Arial" w:hAnsi="Arial"/>
+                <w:b w:val="false"/>
+                <w:bCs w:val="false"/>
+                <w:color w:val="1A1A1A"/>
+                <w:sz w:val="20"/>
+                <w:szCs w:val="20"/>
+              </w:rPr>
+              <w:t xml:space="preserve"/>
+            </w:r>
+          </w:p>
+        </w:tc>
+      </w:tr>
+      <w:tr>
+        <w:tc>
+          <w:tcPr>
+            <w:tcW w:type="dxa" w:w="440"/>
+            <w:tcBorders>
+              <w:top w:val="single" w:color="C5D5E8" w:sz="4"/>
+              <w:left w:val="single" w:color="C5D5E8" w:sz="4"/>
+              <w:bottom w:val="single" w:color="C5D5E8" w:sz="4"/>
+              <w:right w:val="single" w:color="C5D5E8" w:sz="4"/>
+            </w:tcBorders>
+            <w:shd w:fill="FFFFFF" w:val="clear"/>
+            <w:tcMar>
+              <w:top w:type="dxa" w:w="100"/>
+              <w:left w:type="dxa" w:w="140"/>
+              <w:bottom w:type="dxa" w:w="100"/>
+              <w:right w:type="dxa" w:w="140"/>
+            </w:tcMar>
+            <w:vAlign w:val="top"/>
+          </w:tcPr>
+          <w:p>
+            <w:pPr>
+              <w:jc w:val="center"/>
+            </w:pPr>
+            <w:r>
+              <w:rPr>
+                <w:rFonts w:ascii="Arial" w:cs="Arial" w:eastAsia="Arial" w:hAnsi="Arial"/>
+                <w:b/>
+                <w:bCs/>
+                <w:color w:val="1A1A1A"/>
+                <w:sz w:val="20"/>
+                <w:szCs w:val="20"/>
+              </w:rPr>
+              <w:t xml:space="preserve">7</w:t>
+            </w:r>
+          </w:p>
+        </w:tc>
+        <w:tc>
+          <w:tcPr>
+            <w:tcW w:type="dxa" w:w="5106"/>
+            <w:tcBorders>
+              <w:top w:val="single" w:color="C5D5E8" w:sz="4"/>
+              <w:left w:val="single" w:color="C5D5E8" w:sz="4"/>
+              <w:bottom w:val="single" w:color="C5D5E8" w:sz="4"/>
+              <w:right w:val="single" w:color="C5D5E8" w:sz="4"/>
+            </w:tcBorders>
+            <w:shd w:fill="FFFFFF" w:val="clear"/>
+            <w:tcMar>
+              <w:top w:type="dxa" w:w="100"/>
+              <w:left w:type="dxa" w:w="140"/>
+              <w:bottom w:type="dxa" w:w="100"/>
+              <w:right w:type="dxa" w:w="140"/>
+            </w:tcMar>
+            <w:vAlign w:val="top"/>
+          </w:tcPr>
+          <w:p>
+            <w:pPr>
+              <w:jc w:val="left"/>
+            </w:pPr>
+            <w:r>
+              <w:rPr>
+                <w:rFonts w:ascii="Arial" w:cs="Arial" w:eastAsia="Arial" w:hAnsi="Arial"/>
+                <w:b w:val="false"/>
+                <w:bCs w:val="false"/>
+                <w:color w:val="1A1A1A"/>
+                <w:sz w:val="20"/>
+                <w:szCs w:val="20"/>
+              </w:rPr>
+              <w:t xml:space="preserve">Introdurresti questo strumento nel tuo studio come supporto ordinario alla gestione delle richieste?</w:t>
+            </w:r>
+          </w:p>
+        </w:tc>
+        <w:tc>
+          <w:tcPr>
+            <w:tcW w:type="dxa" w:w="1000"/>
+            <w:tcBorders>
+              <w:top w:val="single" w:color="C5D5E8" w:sz="4"/>
+              <w:left w:val="single" w:color="C5D5E8" w:sz="4"/>
+              <w:bottom w:val="single" w:color="C5D5E8" w:sz="4"/>
+              <w:right w:val="single" w:color="C5D5E8" w:sz="4"/>
+            </w:tcBorders>
+            <w:shd w:fill="FFFFFF" w:val="clear"/>
+            <w:tcMar>
+              <w:top w:type="dxa" w:w="100"/>
+              <w:left w:type="dxa" w:w="140"/>
+              <w:bottom w:type="dxa" w:w="100"/>
+              <w:right w:type="dxa" w:w="140"/>
+            </w:tcMar>
+            <w:vAlign w:val="top"/>
+          </w:tcPr>
+          <w:p>
+            <w:pPr>
+              <w:jc w:val="center"/>
+            </w:pPr>
+            <w:r>
+              <w:rPr>
+                <w:rFonts w:ascii="Arial" w:cs="Arial" w:eastAsia="Arial" w:hAnsi="Arial"/>
+                <w:b w:val="false"/>
+                <w:bCs w:val="false"/>
+                <w:color w:val="1A1A1A"/>
+                <w:sz w:val="20"/>
+                <w:szCs w:val="20"/>
+              </w:rPr>
+              <w:t xml:space="preserve">Si / No / Forse</w:t>
+            </w:r>
+          </w:p>
+        </w:tc>
+        <w:tc>
+          <w:tcPr>
+            <w:tcW w:type="dxa" w:w="1480"/>
+            <w:tcBorders>
+              <w:top w:val="single" w:color="C5D5E8" w:sz="4"/>
+              <w:left w:val="single" w:color="C5D5E8" w:sz="4"/>
+              <w:bottom w:val="single" w:color="C5D5E8" w:sz="4"/>
+              <w:right w:val="single" w:color="C5D5E8" w:sz="4"/>
+            </w:tcBorders>
+            <w:shd w:fill="FFFFFF" w:val="clear"/>
+            <w:tcMar>
+              <w:top w:type="dxa" w:w="100"/>
+              <w:left w:type="dxa" w:w="140"/>
+              <w:bottom w:type="dxa" w:w="100"/>
+              <w:right w:type="dxa" w:w="140"/>
+            </w:tcMar>
+            <w:vAlign w:val="top"/>
+          </w:tcPr>
+          <w:p>
+            <w:pPr>
+              <w:jc w:val="left"/>
+            </w:pPr>
+            <w:r>
+              <w:rPr>
+                <w:rFonts w:ascii="Arial" w:cs="Arial" w:eastAsia="Arial" w:hAnsi="Arial"/>
+                <w:b w:val="false"/>
+                <w:bCs w:val="false"/>
+                <w:color w:val="1A1A1A"/>
+                <w:sz w:val="20"/>
+                <w:szCs w:val="20"/>
+              </w:rPr>
+              <w:t xml:space="preserve">Intenzione adozione</w:t>
+            </w:r>
+          </w:p>
+        </w:tc>
+        <w:tc>
+          <w:tcPr>
+            <w:tcW w:type="dxa" w:w="1000"/>
+            <w:tcBorders>
+              <w:top w:val="single" w:color="C5D5E8" w:sz="4"/>
+              <w:left w:val="single" w:color="C5D5E8" w:sz="4"/>
+              <w:bottom w:val="single" w:color="C5D5E8" w:sz="4"/>
+              <w:right w:val="single" w:color="C5D5E8" w:sz="4"/>
+            </w:tcBorders>
+            <w:shd w:fill="FFFFFF" w:val="clear"/>
+            <w:tcMar>
+              <w:top w:type="dxa" w:w="100"/>
+              <w:left w:type="dxa" w:w="140"/>
+              <w:bottom w:type="dxa" w:w="100"/>
+              <w:right w:type="dxa" w:w="140"/>
+            </w:tcMar>
+            <w:vAlign w:val="top"/>
+          </w:tcPr>
+          <w:p>
+            <w:pPr>
+              <w:jc w:val="left"/>
+            </w:pPr>
+            <w:r>
+              <w:rPr>
+                <w:rFonts w:ascii="Arial" w:cs="Arial" w:eastAsia="Arial" w:hAnsi="Arial"/>
+                <w:b w:val="false"/>
+                <w:bCs w:val="false"/>
+                <w:color w:val="1A1A1A"/>
+                <w:sz w:val="20"/>
+                <w:szCs w:val="20"/>
+              </w:rPr>
+              <w:t xml:space="preserve"/>
+            </w:r>
+          </w:p>
+        </w:tc>
+      </w:tr>
+      <w:tr>
+        <w:tc>
+          <w:tcPr>
+            <w:tcW w:type="dxa" w:w="440"/>
+            <w:tcBorders>
+              <w:top w:val="single" w:color="C5D5E8" w:sz="4"/>
+              <w:left w:val="single" w:color="C5D5E8" w:sz="4"/>
+              <w:bottom w:val="single" w:color="C5D5E8" w:sz="4"/>
+              <w:right w:val="single" w:color="C5D5E8" w:sz="4"/>
+            </w:tcBorders>
+            <w:shd w:fill="F5F5F5" w:val="clear"/>
+            <w:tcMar>
+              <w:top w:type="dxa" w:w="100"/>
+              <w:left w:type="dxa" w:w="140"/>
+              <w:bottom w:type="dxa" w:w="100"/>
+              <w:right w:type="dxa" w:w="140"/>
+            </w:tcMar>
+            <w:vAlign w:val="top"/>
+          </w:tcPr>
+          <w:p>
+            <w:pPr>
+              <w:jc w:val="center"/>
+            </w:pPr>
+            <w:r>
+              <w:rPr>
+                <w:rFonts w:ascii="Arial" w:cs="Arial" w:eastAsia="Arial" w:hAnsi="Arial"/>
+                <w:b/>
+                <w:bCs/>
+                <w:color w:val="1A1A1A"/>
+                <w:sz w:val="20"/>
+                <w:szCs w:val="20"/>
+              </w:rPr>
+              <w:t xml:space="preserve">8</w:t>
+            </w:r>
+          </w:p>
+        </w:tc>
+        <w:tc>
+          <w:tcPr>
+            <w:tcW w:type="dxa" w:w="5106"/>
+            <w:tcBorders>
+              <w:top w:val="single" w:color="C5D5E8" w:sz="4"/>
+              <w:left w:val="single" w:color="C5D5E8" w:sz="4"/>
+              <w:bottom w:val="single" w:color="C5D5E8" w:sz="4"/>
+              <w:right w:val="single" w:color="C5D5E8" w:sz="4"/>
+            </w:tcBorders>
+            <w:shd w:fill="F5F5F5" w:val="clear"/>
+            <w:tcMar>
+              <w:top w:type="dxa" w:w="100"/>
+              <w:left w:type="dxa" w:w="140"/>
+              <w:bottom w:type="dxa" w:w="100"/>
+              <w:right w:type="dxa" w:w="140"/>
+            </w:tcMar>
+            <w:vAlign w:val="top"/>
+          </w:tcPr>
+          <w:p>
+            <w:pPr>
+              <w:jc w:val="left"/>
+            </w:pPr>
+            <w:r>
+              <w:rPr>
+                <w:rFonts w:ascii="Arial" w:cs="Arial" w:eastAsia="Arial" w:hAnsi="Arial"/>
+                <w:b w:val="false"/>
+                <w:bCs w:val="false"/>
+                <w:color w:val="1A1A1A"/>
+                <w:sz w:val="20"/>
+                <w:szCs w:val="20"/>
+              </w:rPr>
+              <w:t xml:space="preserve">Cosa cambieresti o aggiungeresti per rendere il sistema piu' utile al tuo lavoro quotidiano?</w:t>
+            </w:r>
+          </w:p>
+        </w:tc>
+        <w:tc>
+          <w:tcPr>
+            <w:tcW w:type="dxa" w:w="1000"/>
+            <w:tcBorders>
+              <w:top w:val="single" w:color="C5D5E8" w:sz="4"/>
+              <w:left w:val="single" w:color="C5D5E8" w:sz="4"/>
+              <w:bottom w:val="single" w:color="C5D5E8" w:sz="4"/>
+              <w:right w:val="single" w:color="C5D5E8" w:sz="4"/>
+            </w:tcBorders>
+            <w:shd w:fill="F5F5F5" w:val="clear"/>
+            <w:tcMar>
+              <w:top w:type="dxa" w:w="100"/>
+              <w:left w:type="dxa" w:w="140"/>
+              <w:bottom w:type="dxa" w:w="100"/>
+              <w:right w:type="dxa" w:w="140"/>
+            </w:tcMar>
+            <w:vAlign w:val="top"/>
+          </w:tcPr>
+          <w:p>
+            <w:pPr>
+              <w:jc w:val="center"/>
+            </w:pPr>
+            <w:r>
+              <w:rPr>
+                <w:rFonts w:ascii="Arial" w:cs="Arial" w:eastAsia="Arial" w:hAnsi="Arial"/>
+                <w:b w:val="false"/>
+                <w:bCs w:val="false"/>
+                <w:color w:val="1A1A1A"/>
+                <w:sz w:val="20"/>
+                <w:szCs w:val="20"/>
+              </w:rPr>
+              <w:t xml:space="preserve">Aperta</w:t>
+            </w:r>
+          </w:p>
+        </w:tc>
+        <w:tc>
+          <w:tcPr>
+            <w:tcW w:type="dxa" w:w="1480"/>
+            <w:tcBorders>
+              <w:top w:val="single" w:color="C5D5E8" w:sz="4"/>
+              <w:left w:val="single" w:color="C5D5E8" w:sz="4"/>
+              <w:bottom w:val="single" w:color="C5D5E8" w:sz="4"/>
+              <w:right w:val="single" w:color="C5D5E8" w:sz="4"/>
+            </w:tcBorders>
+            <w:shd w:fill="F5F5F5" w:val="clear"/>
+            <w:tcMar>
+              <w:top w:type="dxa" w:w="100"/>
+              <w:left w:type="dxa" w:w="140"/>
+              <w:bottom w:type="dxa" w:w="100"/>
+              <w:right w:type="dxa" w:w="140"/>
+            </w:tcMar>
+            <w:vAlign w:val="top"/>
+          </w:tcPr>
+          <w:p>
+            <w:pPr>
+              <w:jc w:val="left"/>
+            </w:pPr>
+            <w:r>
+              <w:rPr>
+                <w:rFonts w:ascii="Arial" w:cs="Arial" w:eastAsia="Arial" w:hAnsi="Arial"/>
+                <w:b w:val="false"/>
+                <w:bCs w:val="false"/>
+                <w:color w:val="1A1A1A"/>
+                <w:sz w:val="20"/>
+                <w:szCs w:val="20"/>
+              </w:rPr>
+              <w:t xml:space="preserve">Qualitativa</w:t>
+            </w:r>
+          </w:p>
+        </w:tc>
+        <w:tc>
+          <w:tcPr>
+            <w:tcW w:type="dxa" w:w="1000"/>
+            <w:tcBorders>
+              <w:top w:val="single" w:color="C5D5E8" w:sz="4"/>
+              <w:left w:val="single" w:color="C5D5E8" w:sz="4"/>
+              <w:bottom w:val="single" w:color="C5D5E8" w:sz="4"/>
+              <w:right w:val="single" w:color="C5D5E8" w:sz="4"/>
+            </w:tcBorders>
+            <w:shd w:fill="F5F5F5" w:val="clear"/>
+            <w:tcMar>
+              <w:top w:type="dxa" w:w="80"/>
+              <w:left w:type="dxa" w:w="100"/>
+              <w:bottom w:type="dxa" w:w="80"/>
+              <w:right w:type="dxa" w:w="100"/>
+            </w:tcMar>
+          </w:tcPr>
+          <w:p/>
+          <w:p/>
+          <w:p/>
+        </w:tc>
+      </w:tr>
+    </w:tbl>
+    <w:p/>
+    <w:p>
+      <w:pPr>
+        <w:spacing w:after="100" w:before="80"/>
+      </w:pPr>
+      <w:r>
+        <w:rPr>
+          <w:rFonts w:ascii="Arial" w:cs="Arial" w:eastAsia="Arial" w:hAnsi="Arial"/>
+          <w:i/>
+          <w:iCs/>
+          <w:color w:val="555555"/>
+          <w:sz w:val="20"/>
+          <w:szCs w:val="20"/>
+        </w:rPr>
+        <w:t xml:space="preserve">Soglia di validazione: punteggio medio &gt;= 4/5 sulle domande 2 e 3; almeno 1 su 2 amministratori risponde Si alla domanda 7.</w:t>
+      </w:r>
+    </w:p>
     <w:sectPr>
       <w:footerReference w:type="default" r:id="rId7"/>
       <w:pgSz w:w="11906" w:h="16838" w:orient="portrait"/>
@@ -2197,7 +5496,7 @@
         <w:sz w:val="16"/>
         <w:szCs w:val="16"/>
       </w:rPr>
-      <w:t xml:space="preserve">CondoCare — Descrizione MVP</w:t>
+      <w:t xml:space="preserve">CondoCare - Descrizione MVP</w:t>
     </w:r>
     <w:r>
       <w:rPr>
@@ -2352,7 +5651,7 @@
     <w:lvl w:ilvl="0" w15:tentative="1">
       <w:start w:val="1"/>
       <w:numFmt w:val="bullet"/>
-      <w:lvlText w:val="•"/>
+      <w:lvlText w:val="*"/>
       <w:lvlJc w:val="left"/>
       <w:pPr>
         <w:ind w:left="560" w:hanging="280"/>

</xml_diff>